<commit_message>
Arrumando a versão 7.0
</commit_message>
<xml_diff>
--- a/doc/[ORIGINAL] DRS Modelo Generalista 01.docx
+++ b/doc/[ORIGINAL] DRS Modelo Generalista 01.docx
@@ -182,7 +182,7 @@
         <w:rPr>
           <w:color w:val="0070C0"/>
         </w:rPr>
-        <w:t>5</w:t>
+        <w:t>7</w:t>
       </w:r>
       <w:r>
         <w:rPr>
@@ -329,19 +329,11 @@
           <w:rFonts w:ascii="Arial" w:eastAsia="Arial" w:hAnsi="Arial" w:cs="Arial"/>
         </w:rPr>
       </w:pPr>
-      <w:proofErr w:type="spellStart"/>
-      <w:r>
-        <w:rPr>
-          <w:rFonts w:ascii="Arial" w:eastAsia="Arial" w:hAnsi="Arial" w:cs="Arial"/>
-        </w:rPr>
-        <w:t>Izhac</w:t>
-      </w:r>
-      <w:proofErr w:type="spellEnd"/>
-      <w:r>
-        <w:rPr>
-          <w:rFonts w:ascii="Arial" w:eastAsia="Arial" w:hAnsi="Arial" w:cs="Arial"/>
-        </w:rPr>
-        <w:t xml:space="preserve"> Nylton Silva Santos</w:t>
+      <w:r>
+        <w:rPr>
+          <w:rFonts w:ascii="Arial" w:eastAsia="Arial" w:hAnsi="Arial" w:cs="Arial"/>
+        </w:rPr>
+        <w:t>Izhac Nylton Silva Santos</w:t>
       </w:r>
     </w:p>
     <w:p>
@@ -4183,21 +4175,7 @@
         <w:rPr>
           <w:rFonts w:ascii="Arial" w:eastAsia="Arial" w:hAnsi="Arial" w:cs="Arial"/>
         </w:rPr>
-        <w:t xml:space="preserve">Sistema de Controle de Clientes e pedidos (SCCP – </w:t>
-      </w:r>
-      <w:proofErr w:type="spellStart"/>
-      <w:r>
-        <w:rPr>
-          <w:rFonts w:ascii="Arial" w:eastAsia="Arial" w:hAnsi="Arial" w:cs="Arial"/>
-        </w:rPr>
-        <w:t>ProtoTech</w:t>
-      </w:r>
-      <w:proofErr w:type="spellEnd"/>
-      <w:r>
-        <w:rPr>
-          <w:rFonts w:ascii="Arial" w:eastAsia="Arial" w:hAnsi="Arial" w:cs="Arial"/>
-        </w:rPr>
-        <w:t xml:space="preserve"> ERP)</w:t>
+        <w:t>Sistema de Controle de Clientes e pedidos (SCCP – ProtoTech ERP)</w:t>
       </w:r>
     </w:p>
     <w:p>
@@ -4977,33 +4955,11 @@
                 <w:rFonts w:ascii="Arial" w:eastAsia="Arial" w:hAnsi="Arial" w:cs="Arial"/>
               </w:rPr>
             </w:pPr>
-            <w:proofErr w:type="spellStart"/>
             <w:r>
               <w:rPr>
                 <w:rFonts w:ascii="Arial" w:eastAsia="Arial" w:hAnsi="Arial" w:cs="Arial"/>
               </w:rPr>
-              <w:t>Create</w:t>
-            </w:r>
-            <w:proofErr w:type="spellEnd"/>
-            <w:r>
-              <w:rPr>
-                <w:rFonts w:ascii="Arial" w:eastAsia="Arial" w:hAnsi="Arial" w:cs="Arial"/>
-              </w:rPr>
-              <w:t xml:space="preserve">, </w:t>
-            </w:r>
-            <w:proofErr w:type="spellStart"/>
-            <w:r>
-              <w:rPr>
-                <w:rFonts w:ascii="Arial" w:eastAsia="Arial" w:hAnsi="Arial" w:cs="Arial"/>
-              </w:rPr>
-              <w:t>Read</w:t>
-            </w:r>
-            <w:proofErr w:type="spellEnd"/>
-            <w:r>
-              <w:rPr>
-                <w:rFonts w:ascii="Arial" w:eastAsia="Arial" w:hAnsi="Arial" w:cs="Arial"/>
-              </w:rPr>
-              <w:t xml:space="preserve">, Update e Delete. </w:t>
+              <w:t xml:space="preserve">Create, Read, Update e Delete. </w:t>
             </w:r>
             <w:r>
               <w:rPr>
@@ -5229,30 +5185,8 @@
               <w:rPr>
                 <w:rFonts w:ascii="Arial" w:eastAsia="Arial" w:hAnsi="Arial" w:cs="Arial"/>
               </w:rPr>
-              <w:t>Model-</w:t>
-            </w:r>
-            <w:proofErr w:type="spellStart"/>
-            <w:r>
-              <w:rPr>
-                <w:rFonts w:ascii="Arial" w:eastAsia="Arial" w:hAnsi="Arial" w:cs="Arial"/>
-              </w:rPr>
-              <w:t>View</w:t>
-            </w:r>
-            <w:proofErr w:type="spellEnd"/>
-            <w:r>
-              <w:rPr>
-                <w:rFonts w:ascii="Arial" w:eastAsia="Arial" w:hAnsi="Arial" w:cs="Arial"/>
-              </w:rPr>
-              <w:t>-</w:t>
-            </w:r>
-            <w:proofErr w:type="spellStart"/>
-            <w:r>
-              <w:rPr>
-                <w:rFonts w:ascii="Arial" w:eastAsia="Arial" w:hAnsi="Arial" w:cs="Arial"/>
-              </w:rPr>
-              <w:t>Controller</w:t>
-            </w:r>
-            <w:proofErr w:type="spellEnd"/>
+              <w:t>Model-View-Controller</w:t>
+            </w:r>
             <w:r>
               <w:rPr>
                 <w:rFonts w:ascii="Arial" w:eastAsia="Arial" w:hAnsi="Arial" w:cs="Arial"/>
@@ -5371,39 +5305,17 @@
                 <w:rFonts w:ascii="Arial" w:eastAsia="Arial" w:hAnsi="Arial" w:cs="Arial"/>
               </w:rPr>
             </w:pPr>
-            <w:proofErr w:type="spellStart"/>
             <w:r>
               <w:rPr>
                 <w:rFonts w:ascii="Arial" w:eastAsia="Arial" w:hAnsi="Arial" w:cs="Arial"/>
               </w:rPr>
-              <w:t>Object-Relational</w:t>
-            </w:r>
-            <w:proofErr w:type="spellEnd"/>
+              <w:t>Object-Relational Mapping</w:t>
+            </w:r>
             <w:r>
               <w:rPr>
                 <w:rFonts w:ascii="Arial" w:eastAsia="Arial" w:hAnsi="Arial" w:cs="Arial"/>
               </w:rPr>
-              <w:t xml:space="preserve"> Mapping</w:t>
-            </w:r>
-            <w:r>
-              <w:rPr>
-                <w:rFonts w:ascii="Arial" w:eastAsia="Arial" w:hAnsi="Arial" w:cs="Arial"/>
-              </w:rPr>
-              <w:t xml:space="preserve"> (Mapeamento Objeto-Relacional via </w:t>
-            </w:r>
-            <w:proofErr w:type="spellStart"/>
-            <w:r>
-              <w:rPr>
-                <w:rFonts w:ascii="Arial" w:eastAsia="Arial" w:hAnsi="Arial" w:cs="Arial"/>
-              </w:rPr>
-              <w:t>Hibernate</w:t>
-            </w:r>
-            <w:proofErr w:type="spellEnd"/>
-            <w:r>
-              <w:rPr>
-                <w:rFonts w:ascii="Arial" w:eastAsia="Arial" w:hAnsi="Arial" w:cs="Arial"/>
-              </w:rPr>
-              <w:t>/JPA)</w:t>
+              <w:t xml:space="preserve"> (Mapeamento Objeto-Relacional via Hibernate/JPA)</w:t>
             </w:r>
           </w:p>
         </w:tc>
@@ -5505,33 +5417,11 @@
                 <w:rFonts w:ascii="Arial" w:eastAsia="Arial" w:hAnsi="Arial" w:cs="Arial"/>
               </w:rPr>
             </w:pPr>
-            <w:proofErr w:type="spellStart"/>
             <w:r>
               <w:rPr>
                 <w:rFonts w:ascii="Arial" w:eastAsia="Arial" w:hAnsi="Arial" w:cs="Arial"/>
               </w:rPr>
-              <w:t>Portable</w:t>
-            </w:r>
-            <w:proofErr w:type="spellEnd"/>
-            <w:r>
-              <w:rPr>
-                <w:rFonts w:ascii="Arial" w:eastAsia="Arial" w:hAnsi="Arial" w:cs="Arial"/>
-              </w:rPr>
-              <w:t xml:space="preserve"> </w:t>
-            </w:r>
-            <w:proofErr w:type="spellStart"/>
-            <w:r>
-              <w:rPr>
-                <w:rFonts w:ascii="Arial" w:eastAsia="Arial" w:hAnsi="Arial" w:cs="Arial"/>
-              </w:rPr>
-              <w:t>Document</w:t>
-            </w:r>
-            <w:proofErr w:type="spellEnd"/>
-            <w:r>
-              <w:rPr>
-                <w:rFonts w:ascii="Arial" w:eastAsia="Arial" w:hAnsi="Arial" w:cs="Arial"/>
-              </w:rPr>
-              <w:t xml:space="preserve"> Format (Formato de documento para recibos)</w:t>
+              <w:t>Portable Document Format (Formato de documento para recibos)</w:t>
             </w:r>
           </w:p>
         </w:tc>
@@ -6228,21 +6118,7 @@
               <w:rPr>
                 <w:rFonts w:ascii="Arial" w:eastAsia="Arial" w:hAnsi="Arial" w:cs="Arial"/>
               </w:rPr>
-              <w:t xml:space="preserve">Banco de dados responsável pelo armazenamento persistente, execução de </w:t>
-            </w:r>
-            <w:proofErr w:type="spellStart"/>
-            <w:r>
-              <w:rPr>
-                <w:rFonts w:ascii="Arial" w:eastAsia="Arial" w:hAnsi="Arial" w:cs="Arial"/>
-              </w:rPr>
-              <w:t>constraints</w:t>
-            </w:r>
-            <w:proofErr w:type="spellEnd"/>
-            <w:r>
-              <w:rPr>
-                <w:rFonts w:ascii="Arial" w:eastAsia="Arial" w:hAnsi="Arial" w:cs="Arial"/>
-              </w:rPr>
-              <w:t xml:space="preserve"> e integridade das tabelas.</w:t>
+              <w:t>Banco de dados responsável pelo armazenamento persistente, execução de constraints e integridade das tabelas.</w:t>
             </w:r>
           </w:p>
         </w:tc>
@@ -7125,55 +7001,7 @@
           <w:rFonts w:ascii="Arial" w:eastAsia="Arial" w:hAnsi="Arial" w:cs="Arial"/>
           <w:color w:val="000000"/>
         </w:rPr>
-        <w:t xml:space="preserve">O sistema deve verificar o estoque após cada movimentação e registrar alerta na tabela </w:t>
-      </w:r>
-      <w:proofErr w:type="spellStart"/>
-      <w:r>
-        <w:rPr>
-          <w:rFonts w:ascii="Arial" w:eastAsia="Arial" w:hAnsi="Arial" w:cs="Arial"/>
-          <w:color w:val="000000"/>
-        </w:rPr>
-        <w:t>AlertaEstoque</w:t>
-      </w:r>
-      <w:proofErr w:type="spellEnd"/>
-      <w:r>
-        <w:rPr>
-          <w:rFonts w:ascii="Arial" w:eastAsia="Arial" w:hAnsi="Arial" w:cs="Arial"/>
-          <w:color w:val="000000"/>
-        </w:rPr>
-        <w:t xml:space="preserve"> caso </w:t>
-      </w:r>
-      <w:proofErr w:type="spellStart"/>
-      <w:r>
-        <w:rPr>
-          <w:rFonts w:ascii="Arial" w:eastAsia="Arial" w:hAnsi="Arial" w:cs="Arial"/>
-          <w:color w:val="000000"/>
-        </w:rPr>
-        <w:t>quantidadeAtual</w:t>
-      </w:r>
-      <w:proofErr w:type="spellEnd"/>
-      <w:r>
-        <w:rPr>
-          <w:rFonts w:ascii="Arial" w:eastAsia="Arial" w:hAnsi="Arial" w:cs="Arial"/>
-          <w:color w:val="000000"/>
-        </w:rPr>
-        <w:t xml:space="preserve"> &lt;= </w:t>
-      </w:r>
-      <w:proofErr w:type="spellStart"/>
-      <w:r>
-        <w:rPr>
-          <w:rFonts w:ascii="Arial" w:eastAsia="Arial" w:hAnsi="Arial" w:cs="Arial"/>
-          <w:color w:val="000000"/>
-        </w:rPr>
-        <w:t>estoqueMinimo</w:t>
-      </w:r>
-      <w:proofErr w:type="spellEnd"/>
-      <w:r>
-        <w:rPr>
-          <w:rFonts w:ascii="Arial" w:eastAsia="Arial" w:hAnsi="Arial" w:cs="Arial"/>
-          <w:color w:val="000000"/>
-        </w:rPr>
-        <w:t>. (Prioridade: Importante)</w:t>
+        <w:t>O sistema deve verificar o estoque após cada movimentação e registrar alerta na tabela AlertaEstoque caso quantidadeAtual &lt;= estoqueMinimo. (Prioridade: Importante)</w:t>
       </w:r>
     </w:p>
     <w:p>
@@ -8071,55 +7899,13 @@
         <w:rPr>
           <w:rFonts w:ascii="Arial" w:eastAsia="Arial" w:hAnsi="Arial" w:cs="Arial"/>
         </w:rPr>
-        <w:t>O sistema deverá utilizar uma arquitetura baseada no padrão MVC (Model-</w:t>
-      </w:r>
-      <w:proofErr w:type="spellStart"/>
-      <w:r>
-        <w:rPr>
-          <w:rFonts w:ascii="Arial" w:eastAsia="Arial" w:hAnsi="Arial" w:cs="Arial"/>
-        </w:rPr>
-        <w:t>View</w:t>
-      </w:r>
-      <w:proofErr w:type="spellEnd"/>
-      <w:r>
-        <w:rPr>
-          <w:rFonts w:ascii="Arial" w:eastAsia="Arial" w:hAnsi="Arial" w:cs="Arial"/>
-        </w:rPr>
-        <w:t>-</w:t>
-      </w:r>
-      <w:proofErr w:type="spellStart"/>
-      <w:r>
-        <w:rPr>
-          <w:rFonts w:ascii="Arial" w:eastAsia="Arial" w:hAnsi="Arial" w:cs="Arial"/>
-        </w:rPr>
-        <w:t>Controller</w:t>
-      </w:r>
-      <w:proofErr w:type="spellEnd"/>
-      <w:r>
-        <w:rPr>
-          <w:rFonts w:ascii="Arial" w:eastAsia="Arial" w:hAnsi="Arial" w:cs="Arial"/>
-        </w:rPr>
-        <w:t xml:space="preserve">), </w:t>
-      </w:r>
-      <w:r>
-        <w:rPr>
-          <w:rFonts w:ascii="Arial" w:eastAsia="Arial" w:hAnsi="Arial" w:cs="Arial"/>
-        </w:rPr>
-        <w:t xml:space="preserve">com clara separação entre Controllers, Services, </w:t>
-      </w:r>
-      <w:proofErr w:type="spellStart"/>
-      <w:r>
-        <w:rPr>
-          <w:rFonts w:ascii="Arial" w:eastAsia="Arial" w:hAnsi="Arial" w:cs="Arial"/>
-        </w:rPr>
-        <w:t>Repositories</w:t>
-      </w:r>
-      <w:proofErr w:type="spellEnd"/>
-      <w:r>
-        <w:rPr>
-          <w:rFonts w:ascii="Arial" w:eastAsia="Arial" w:hAnsi="Arial" w:cs="Arial"/>
-        </w:rPr>
-        <w:t xml:space="preserve"> e Models no Spring Boot </w:t>
+        <w:t xml:space="preserve">O sistema deverá utilizar uma arquitetura baseada no padrão MVC (Model-View-Controller), </w:t>
+      </w:r>
+      <w:r>
+        <w:rPr>
+          <w:rFonts w:ascii="Arial" w:eastAsia="Arial" w:hAnsi="Arial" w:cs="Arial"/>
+        </w:rPr>
+        <w:t xml:space="preserve">com clara separação entre Controllers, Services, Repositories e Models no Spring Boot </w:t>
       </w:r>
     </w:p>
     <w:p>
@@ -8219,21 +8005,7 @@
         <w:rPr>
           <w:rFonts w:ascii="Arial" w:eastAsia="Arial" w:hAnsi="Arial" w:cs="Arial"/>
         </w:rPr>
-        <w:t xml:space="preserve">O tempo de resposta para </w:t>
-      </w:r>
-      <w:proofErr w:type="spellStart"/>
-      <w:r>
-        <w:rPr>
-          <w:rFonts w:ascii="Arial" w:eastAsia="Arial" w:hAnsi="Arial" w:cs="Arial"/>
-        </w:rPr>
-        <w:t>opereções</w:t>
-      </w:r>
-      <w:proofErr w:type="spellEnd"/>
-      <w:r>
-        <w:rPr>
-          <w:rFonts w:ascii="Arial" w:eastAsia="Arial" w:hAnsi="Arial" w:cs="Arial"/>
-        </w:rPr>
-        <w:t xml:space="preserve"> normais de consulta e gravação deve ser inferior a 2 segundos em ambiente de rede local.</w:t>
+        <w:t>O tempo de resposta para opereções normais de consulta e gravação deve ser inferior a 2 segundos em ambiente de rede local.</w:t>
       </w:r>
     </w:p>
     <w:p>
@@ -8362,21 +8134,7 @@
         <w:rPr>
           <w:rFonts w:ascii="Arial" w:eastAsia="Arial" w:hAnsi="Arial" w:cs="Arial"/>
         </w:rPr>
-        <w:t xml:space="preserve">O sistema deve utilizar o SGBD MySQL 8.0 gerenciado via Spring Data JPA e </w:t>
-      </w:r>
-      <w:proofErr w:type="spellStart"/>
-      <w:r>
-        <w:rPr>
-          <w:rFonts w:ascii="Arial" w:eastAsia="Arial" w:hAnsi="Arial" w:cs="Arial"/>
-        </w:rPr>
-        <w:t>Hibernate</w:t>
-      </w:r>
-      <w:proofErr w:type="spellEnd"/>
-      <w:r>
-        <w:rPr>
-          <w:rFonts w:ascii="Arial" w:eastAsia="Arial" w:hAnsi="Arial" w:cs="Arial"/>
-        </w:rPr>
-        <w:t>.</w:t>
+        <w:t>O sistema deve utilizar o SGBD MySQL 8.0 gerenciado via Spring Data JPA e Hibernate.</w:t>
       </w:r>
     </w:p>
     <w:p>
@@ -8673,36 +8431,13 @@
           <w:bCs/>
           <w:color w:val="000000"/>
         </w:rPr>
-        <w:t xml:space="preserve"> </w:t>
-      </w:r>
-      <w:r>
-        <w:rPr>
-          <w:rFonts w:ascii="Arial" w:eastAsia="Arial" w:hAnsi="Arial" w:cs="Arial"/>
-          <w:b/>
-          <w:bCs/>
-          <w:color w:val="000000"/>
-        </w:rPr>
-        <w:t xml:space="preserve"> </w:t>
-      </w:r>
-      <w:r>
-        <w:rPr>
-          <w:rFonts w:ascii="Arial" w:eastAsia="Arial" w:hAnsi="Arial" w:cs="Arial"/>
-        </w:rPr>
-        <w:t>A entidade Estoque deve conter controle de concorrência com @Version para evitar sobrescritas concorrentes de saldo (</w:t>
-      </w:r>
-      <w:proofErr w:type="spellStart"/>
-      <w:r>
-        <w:rPr>
-          <w:rFonts w:ascii="Arial" w:eastAsia="Arial" w:hAnsi="Arial" w:cs="Arial"/>
-        </w:rPr>
-        <w:t>lost</w:t>
-      </w:r>
-      <w:proofErr w:type="spellEnd"/>
-      <w:r>
-        <w:rPr>
-          <w:rFonts w:ascii="Arial" w:eastAsia="Arial" w:hAnsi="Arial" w:cs="Arial"/>
-        </w:rPr>
-        <w:t xml:space="preserve"> updates).</w:t>
+        <w:t xml:space="preserve">  </w:t>
+      </w:r>
+      <w:r>
+        <w:rPr>
+          <w:rFonts w:ascii="Arial" w:eastAsia="Arial" w:hAnsi="Arial" w:cs="Arial"/>
+        </w:rPr>
+        <w:t>A entidade Estoque deve conter controle de concorrência com @Version para evitar sobrescritas concorrentes de saldo (lost updates).</w:t>
       </w:r>
     </w:p>
     <w:p>
@@ -8852,21 +8587,7 @@
         <w:rPr>
           <w:rFonts w:ascii="Arial" w:eastAsia="Arial" w:hAnsi="Arial" w:cs="Arial"/>
         </w:rPr>
-        <w:t xml:space="preserve">Interface responsiva construída em Bootstrap5, com componentes de busca dinâmica Tom </w:t>
-      </w:r>
-      <w:proofErr w:type="spellStart"/>
-      <w:r>
-        <w:rPr>
-          <w:rFonts w:ascii="Arial" w:eastAsia="Arial" w:hAnsi="Arial" w:cs="Arial"/>
-        </w:rPr>
-        <w:t>Select</w:t>
-      </w:r>
-      <w:proofErr w:type="spellEnd"/>
-      <w:r>
-        <w:rPr>
-          <w:rFonts w:ascii="Arial" w:eastAsia="Arial" w:hAnsi="Arial" w:cs="Arial"/>
-        </w:rPr>
-        <w:t xml:space="preserve"> e formulários com feedback contextual.</w:t>
+        <w:t>Interface responsiva construída em Bootstrap5, com componentes de busca dinâmica Tom Select e formulários com feedback contextual.</w:t>
       </w:r>
     </w:p>
     <w:p>
@@ -8988,50 +8709,13 @@
           <w:bCs/>
           <w:color w:val="000000"/>
         </w:rPr>
-        <w:t xml:space="preserve"> </w:t>
-      </w:r>
-      <w:r>
-        <w:rPr>
-          <w:rFonts w:ascii="Arial" w:eastAsia="Arial" w:hAnsi="Arial" w:cs="Arial"/>
-          <w:b/>
-          <w:bCs/>
-          <w:color w:val="000000"/>
-        </w:rPr>
-        <w:t xml:space="preserve"> </w:t>
-      </w:r>
-      <w:r>
-        <w:rPr>
-          <w:rFonts w:ascii="Arial" w:eastAsia="Arial" w:hAnsi="Arial" w:cs="Arial"/>
-        </w:rPr>
-        <w:t xml:space="preserve">Regras de obrigatoriedade, formato de e-mail e máscaras de CPF e telefone devem ser validadas via Bean </w:t>
-      </w:r>
-      <w:proofErr w:type="spellStart"/>
-      <w:r>
-        <w:rPr>
-          <w:rFonts w:ascii="Arial" w:eastAsia="Arial" w:hAnsi="Arial" w:cs="Arial"/>
-        </w:rPr>
-        <w:t>Validation</w:t>
-      </w:r>
-      <w:proofErr w:type="spellEnd"/>
-      <w:r>
-        <w:rPr>
-          <w:rFonts w:ascii="Arial" w:eastAsia="Arial" w:hAnsi="Arial" w:cs="Arial"/>
-        </w:rPr>
-        <w:t xml:space="preserve"> (</w:t>
-      </w:r>
-      <w:proofErr w:type="spellStart"/>
-      <w:r>
-        <w:rPr>
-          <w:rFonts w:ascii="Arial" w:eastAsia="Arial" w:hAnsi="Arial" w:cs="Arial"/>
-        </w:rPr>
-        <w:t>jakarta.validation</w:t>
-      </w:r>
-      <w:proofErr w:type="spellEnd"/>
-      <w:r>
-        <w:rPr>
-          <w:rFonts w:ascii="Arial" w:eastAsia="Arial" w:hAnsi="Arial" w:cs="Arial"/>
-        </w:rPr>
-        <w:t>).</w:t>
+        <w:t xml:space="preserve">  </w:t>
+      </w:r>
+      <w:r>
+        <w:rPr>
+          <w:rFonts w:ascii="Arial" w:eastAsia="Arial" w:hAnsi="Arial" w:cs="Arial"/>
+        </w:rPr>
+        <w:t>Regras de obrigatoriedade, formato de e-mail e máscaras de CPF e telefone devem ser validadas via Bean Validation (jakarta.validation).</w:t>
       </w:r>
     </w:p>
     <w:p>
@@ -9463,35 +9147,7 @@
         <w:rPr>
           <w:rFonts w:ascii="Arial" w:eastAsia="Arial" w:hAnsi="Arial" w:cs="Arial"/>
         </w:rPr>
-        <w:t xml:space="preserve">A emissão de relatórios e recibos deve utilizar o motor </w:t>
-      </w:r>
-      <w:proofErr w:type="spellStart"/>
-      <w:r>
-        <w:rPr>
-          <w:rFonts w:ascii="Arial" w:eastAsia="Arial" w:hAnsi="Arial" w:cs="Arial"/>
-        </w:rPr>
-        <w:t>OpenHTMLtoPDF</w:t>
-      </w:r>
-      <w:proofErr w:type="spellEnd"/>
-      <w:r>
-        <w:rPr>
-          <w:rFonts w:ascii="Arial" w:eastAsia="Arial" w:hAnsi="Arial" w:cs="Arial"/>
-        </w:rPr>
-        <w:t xml:space="preserve"> om CSS </w:t>
-      </w:r>
-      <w:proofErr w:type="spellStart"/>
-      <w:r>
-        <w:rPr>
-          <w:rFonts w:ascii="Arial" w:eastAsia="Arial" w:hAnsi="Arial" w:cs="Arial"/>
-        </w:rPr>
-        <w:t>Paged</w:t>
-      </w:r>
-      <w:proofErr w:type="spellEnd"/>
-      <w:r>
-        <w:rPr>
-          <w:rFonts w:ascii="Arial" w:eastAsia="Arial" w:hAnsi="Arial" w:cs="Arial"/>
-        </w:rPr>
-        <w:t xml:space="preserve"> Media (@page), gerando documentos A4 padronizados com numeração de páginas automática</w:t>
+        <w:t>A emissão de relatórios e recibos deve utilizar o motor OpenHTMLtoPDF om CSS Paged Media (@page), gerando documentos A4 padronizados com numeração de páginas automática</w:t>
       </w:r>
     </w:p>
     <w:p>
@@ -9714,7 +9370,6 @@
           <w:rFonts w:ascii="Arial" w:hAnsi="Arial" w:cs="Arial"/>
         </w:rPr>
       </w:pPr>
-      <w:proofErr w:type="spellStart"/>
       <w:r>
         <w:rPr>
           <w:rFonts w:ascii="Arial" w:hAnsi="Arial" w:cs="Arial"/>
@@ -9729,34 +9384,7 @@
           <w:b/>
           <w:bCs/>
         </w:rPr>
-        <w:t>epositories</w:t>
-      </w:r>
-      <w:proofErr w:type="spellEnd"/>
-      <w:r>
-        <w:rPr>
-          <w:rFonts w:ascii="Arial" w:hAnsi="Arial" w:cs="Arial"/>
-          <w:b/>
-          <w:bCs/>
-        </w:rPr>
-        <w:t xml:space="preserve"> (</w:t>
-      </w:r>
-      <w:proofErr w:type="spellStart"/>
-      <w:r>
-        <w:rPr>
-          <w:rFonts w:ascii="Arial" w:hAnsi="Arial" w:cs="Arial"/>
-          <w:b/>
-          <w:bCs/>
-        </w:rPr>
-        <w:t>JpaRepository</w:t>
-      </w:r>
-      <w:proofErr w:type="spellEnd"/>
-      <w:r>
-        <w:rPr>
-          <w:rFonts w:ascii="Arial" w:hAnsi="Arial" w:cs="Arial"/>
-          <w:b/>
-          <w:bCs/>
-        </w:rPr>
-        <w:t xml:space="preserve">): </w:t>
+        <w:t xml:space="preserve">epositories (JpaRepository): </w:t>
       </w:r>
       <w:r>
         <w:rPr>
@@ -9784,7 +9412,6 @@
           <w:rFonts w:ascii="Arial" w:hAnsi="Arial" w:cs="Arial"/>
         </w:rPr>
       </w:pPr>
-      <w:proofErr w:type="spellStart"/>
       <w:r>
         <w:rPr>
           <w:rFonts w:ascii="Arial" w:hAnsi="Arial" w:cs="Arial"/>
@@ -9799,76 +9426,25 @@
           <w:b/>
           <w:bCs/>
         </w:rPr>
-        <w:t>ervice</w:t>
-      </w:r>
-      <w:proofErr w:type="spellEnd"/>
+        <w:t>ervice:</w:t>
+      </w:r>
       <w:r>
         <w:rPr>
           <w:rFonts w:ascii="Arial" w:hAnsi="Arial" w:cs="Arial"/>
-          <w:b/>
-          <w:bCs/>
-        </w:rPr>
-        <w:t>:</w:t>
+        </w:rPr>
+        <w:t xml:space="preserve"> </w:t>
       </w:r>
       <w:r>
         <w:rPr>
           <w:rFonts w:ascii="Arial" w:hAnsi="Arial" w:cs="Arial"/>
         </w:rPr>
-        <w:t xml:space="preserve"> </w:t>
+        <w:t>(@Service / @Transactional): Executam regras de negócio como a validação e abatimento atômico do estoque na criação de um pedido, cálculo de subtotais e geração de PDFs com a biblioteca iText.</w:t>
       </w:r>
       <w:r>
         <w:rPr>
           <w:rFonts w:ascii="Arial" w:hAnsi="Arial" w:cs="Arial"/>
         </w:rPr>
-        <w:t xml:space="preserve">(@Service / @Transactional): Executam regras de negócio como a validação e abatimento atômico do estoque na criação de um pedido, cálculo de subtotais e geração de </w:t>
-      </w:r>
-      <w:proofErr w:type="spellStart"/>
-      <w:r>
-        <w:rPr>
-          <w:rFonts w:ascii="Arial" w:hAnsi="Arial" w:cs="Arial"/>
-        </w:rPr>
-        <w:t>PDFs</w:t>
-      </w:r>
-      <w:proofErr w:type="spellEnd"/>
-      <w:r>
-        <w:rPr>
-          <w:rFonts w:ascii="Arial" w:hAnsi="Arial" w:cs="Arial"/>
-        </w:rPr>
-        <w:t xml:space="preserve"> com a biblioteca </w:t>
-      </w:r>
-      <w:proofErr w:type="spellStart"/>
-      <w:r>
-        <w:rPr>
-          <w:rFonts w:ascii="Arial" w:hAnsi="Arial" w:cs="Arial"/>
-        </w:rPr>
-        <w:t>iText.</w:t>
-      </w:r>
-      <w:r>
-        <w:rPr>
-          <w:rFonts w:ascii="Arial" w:hAnsi="Arial" w:cs="Arial"/>
-        </w:rPr>
-        <w:t>controller</w:t>
-      </w:r>
-      <w:proofErr w:type="spellEnd"/>
-      <w:r>
-        <w:rPr>
-          <w:rFonts w:ascii="Arial" w:hAnsi="Arial" w:cs="Arial"/>
-        </w:rPr>
-        <w:t xml:space="preserve">: Roteamento HTTP, tratamento de validações e alimentação das </w:t>
-      </w:r>
-      <w:proofErr w:type="spellStart"/>
-      <w:r>
-        <w:rPr>
-          <w:rFonts w:ascii="Arial" w:hAnsi="Arial" w:cs="Arial"/>
-        </w:rPr>
-        <w:t>views</w:t>
-      </w:r>
-      <w:proofErr w:type="spellEnd"/>
-      <w:r>
-        <w:rPr>
-          <w:rFonts w:ascii="Arial" w:hAnsi="Arial" w:cs="Arial"/>
-        </w:rPr>
-        <w:t>.</w:t>
+        <w:t>controller: Roteamento HTTP, tratamento de validações e alimentação das views.</w:t>
       </w:r>
     </w:p>
     <w:p>
@@ -9890,23 +9466,13 @@
           <w:rFonts w:ascii="Arial" w:hAnsi="Arial" w:cs="Arial"/>
         </w:rPr>
       </w:pPr>
-      <w:proofErr w:type="spellStart"/>
       <w:r>
         <w:rPr>
           <w:rFonts w:ascii="Arial" w:hAnsi="Arial" w:cs="Arial"/>
           <w:b/>
           <w:bCs/>
         </w:rPr>
-        <w:t>config</w:t>
-      </w:r>
-      <w:proofErr w:type="spellEnd"/>
-      <w:r>
-        <w:rPr>
-          <w:rFonts w:ascii="Arial" w:hAnsi="Arial" w:cs="Arial"/>
-          <w:b/>
-          <w:bCs/>
-        </w:rPr>
-        <w:t>:</w:t>
+        <w:t>config:</w:t>
       </w:r>
       <w:r>
         <w:rPr>
@@ -9934,7 +9500,6 @@
           <w:rFonts w:ascii="Arial" w:hAnsi="Arial" w:cs="Arial"/>
         </w:rPr>
       </w:pPr>
-      <w:proofErr w:type="spellStart"/>
       <w:r>
         <w:rPr>
           <w:rFonts w:ascii="Arial" w:hAnsi="Arial" w:cs="Arial"/>
@@ -9949,64 +9514,13 @@
           <w:b/>
           <w:bCs/>
         </w:rPr>
-        <w:t>ontrollers</w:t>
-      </w:r>
-      <w:proofErr w:type="spellEnd"/>
+        <w:t xml:space="preserve">ontrollers (@Controller): </w:t>
+      </w:r>
       <w:r>
         <w:rPr>
           <w:rFonts w:ascii="Arial" w:hAnsi="Arial" w:cs="Arial"/>
-          <w:b/>
-          <w:bCs/>
-        </w:rPr>
-        <w:t xml:space="preserve"> (@Controller): </w:t>
-      </w:r>
-      <w:r>
-        <w:rPr>
-          <w:rFonts w:ascii="Arial" w:hAnsi="Arial" w:cs="Arial"/>
-        </w:rPr>
-        <w:t xml:space="preserve">Recebem requisições HTTP, efetuam validações (@NotBlank, @Email) e enviam dados para serem renderizados pelas </w:t>
-      </w:r>
-      <w:proofErr w:type="spellStart"/>
-      <w:r>
-        <w:rPr>
-          <w:rFonts w:ascii="Arial" w:hAnsi="Arial" w:cs="Arial"/>
-        </w:rPr>
-        <w:t>views</w:t>
-      </w:r>
-      <w:proofErr w:type="spellEnd"/>
-      <w:r>
-        <w:rPr>
-          <w:rFonts w:ascii="Arial" w:hAnsi="Arial" w:cs="Arial"/>
-        </w:rPr>
-        <w:t xml:space="preserve"> </w:t>
-      </w:r>
-      <w:proofErr w:type="spellStart"/>
-      <w:r>
-        <w:rPr>
-          <w:rFonts w:ascii="Arial" w:hAnsi="Arial" w:cs="Arial"/>
-        </w:rPr>
-        <w:t>Thymeleaf</w:t>
-      </w:r>
-      <w:proofErr w:type="spellEnd"/>
-      <w:r>
-        <w:rPr>
-          <w:rFonts w:ascii="Arial" w:hAnsi="Arial" w:cs="Arial"/>
-        </w:rPr>
-        <w:t xml:space="preserve"> com componentes </w:t>
-      </w:r>
-      <w:proofErr w:type="spellStart"/>
-      <w:r>
-        <w:rPr>
-          <w:rFonts w:ascii="Arial" w:hAnsi="Arial" w:cs="Arial"/>
-        </w:rPr>
-        <w:t>Bootstrap</w:t>
-      </w:r>
-      <w:proofErr w:type="spellEnd"/>
-      <w:r>
-        <w:rPr>
-          <w:rFonts w:ascii="Arial" w:hAnsi="Arial" w:cs="Arial"/>
-        </w:rPr>
-        <w:t xml:space="preserve"> 5.</w:t>
+        </w:rPr>
+        <w:t>Recebem requisições HTTP, efetuam validações (@NotBlank, @Email) e enviam dados para serem renderizados pelas views Thymeleaf com componentes Bootstrap 5.</w:t>
       </w:r>
     </w:p>
     <w:p>
@@ -10490,23 +10004,7 @@
                 <w:rFonts w:ascii="Arial" w:hAnsi="Arial" w:cs="Arial"/>
                 <w:color w:val="000000"/>
               </w:rPr>
-              <w:t>Modelagem relacional, diagrama E-R e script DDL/DML (</w:t>
-            </w:r>
-            <w:proofErr w:type="spellStart"/>
-            <w:r>
-              <w:rPr>
-                <w:rFonts w:ascii="Arial" w:hAnsi="Arial" w:cs="Arial"/>
-                <w:color w:val="000000"/>
-              </w:rPr>
-              <w:t>prototech_db</w:t>
-            </w:r>
-            <w:proofErr w:type="spellEnd"/>
-            <w:r>
-              <w:rPr>
-                <w:rFonts w:ascii="Arial" w:hAnsi="Arial" w:cs="Arial"/>
-                <w:color w:val="000000"/>
-              </w:rPr>
-              <w:t>)</w:t>
+              <w:t>Modelagem relacional, diagrama E-R e script DDL/DML (prototech_db)</w:t>
             </w:r>
           </w:p>
         </w:tc>
@@ -10677,39 +10175,7 @@
                 <w:rFonts w:ascii="Arial" w:hAnsi="Arial" w:cs="Arial"/>
                 <w:color w:val="000000"/>
               </w:rPr>
-              <w:t xml:space="preserve">Estruturação </w:t>
-            </w:r>
-            <w:proofErr w:type="spellStart"/>
-            <w:r>
-              <w:rPr>
-                <w:rFonts w:ascii="Arial" w:hAnsi="Arial" w:cs="Arial"/>
-                <w:color w:val="000000"/>
-              </w:rPr>
-              <w:t>Maven</w:t>
-            </w:r>
-            <w:proofErr w:type="spellEnd"/>
-            <w:r>
-              <w:rPr>
-                <w:rFonts w:ascii="Arial" w:hAnsi="Arial" w:cs="Arial"/>
-                <w:color w:val="000000"/>
-              </w:rPr>
-              <w:t xml:space="preserve">, configuração do </w:t>
-            </w:r>
-            <w:proofErr w:type="spellStart"/>
-            <w:r>
-              <w:rPr>
-                <w:rFonts w:ascii="Arial" w:hAnsi="Arial" w:cs="Arial"/>
-                <w:color w:val="000000"/>
-              </w:rPr>
-              <w:t>application.properties</w:t>
-            </w:r>
-            <w:proofErr w:type="spellEnd"/>
-            <w:r>
-              <w:rPr>
-                <w:rFonts w:ascii="Arial" w:hAnsi="Arial" w:cs="Arial"/>
-                <w:color w:val="000000"/>
-              </w:rPr>
-              <w:t xml:space="preserve"> e entidades @Entity.</w:t>
+              <w:t>Estruturação Maven, configuração do application.properties e entidades @Entity.</w:t>
             </w:r>
           </w:p>
         </w:tc>
@@ -10880,23 +10346,7 @@
                 <w:rFonts w:ascii="Arial" w:hAnsi="Arial" w:cs="Arial"/>
                 <w:color w:val="000000"/>
               </w:rPr>
-              <w:t xml:space="preserve">Implementação dos </w:t>
-            </w:r>
-            <w:proofErr w:type="spellStart"/>
-            <w:r>
-              <w:rPr>
-                <w:rFonts w:ascii="Arial" w:hAnsi="Arial" w:cs="Arial"/>
-                <w:color w:val="000000"/>
-              </w:rPr>
-              <w:t>Repositories</w:t>
-            </w:r>
-            <w:proofErr w:type="spellEnd"/>
-            <w:r>
-              <w:rPr>
-                <w:rFonts w:ascii="Arial" w:hAnsi="Arial" w:cs="Arial"/>
-                <w:color w:val="000000"/>
-              </w:rPr>
-              <w:t xml:space="preserve"> e Services com controle transacional e alertas</w:t>
+              <w:t>Implementação dos Repositories e Services com controle transacional e alertas</w:t>
             </w:r>
           </w:p>
         </w:tc>
@@ -11068,39 +10518,7 @@
                 <w:rFonts w:ascii="Arial" w:hAnsi="Arial" w:cs="Arial"/>
                 <w:color w:val="000000"/>
               </w:rPr>
-              <w:t xml:space="preserve">Desenvolvimento dos Controllers MVC e telas </w:t>
-            </w:r>
-            <w:proofErr w:type="spellStart"/>
-            <w:r>
-              <w:rPr>
-                <w:rFonts w:ascii="Arial" w:hAnsi="Arial" w:cs="Arial"/>
-                <w:color w:val="000000"/>
-              </w:rPr>
-              <w:t>Thymeleaf</w:t>
-            </w:r>
-            <w:proofErr w:type="spellEnd"/>
-            <w:r>
-              <w:rPr>
-                <w:rFonts w:ascii="Arial" w:hAnsi="Arial" w:cs="Arial"/>
-                <w:color w:val="000000"/>
-              </w:rPr>
-              <w:t xml:space="preserve"> com </w:t>
-            </w:r>
-            <w:proofErr w:type="spellStart"/>
-            <w:r>
-              <w:rPr>
-                <w:rFonts w:ascii="Arial" w:hAnsi="Arial" w:cs="Arial"/>
-                <w:color w:val="000000"/>
-              </w:rPr>
-              <w:t>Bootstrap</w:t>
-            </w:r>
-            <w:proofErr w:type="spellEnd"/>
-            <w:r>
-              <w:rPr>
-                <w:rFonts w:ascii="Arial" w:hAnsi="Arial" w:cs="Arial"/>
-                <w:color w:val="000000"/>
-              </w:rPr>
-              <w:t xml:space="preserve"> 5</w:t>
+              <w:t>Desenvolvimento dos Controllers MVC e telas Thymeleaf com Bootstrap 5</w:t>
             </w:r>
           </w:p>
         </w:tc>
@@ -11279,47 +10697,7 @@
                 <w:sz w:val="22"/>
                 <w:szCs w:val="22"/>
               </w:rPr>
-              <w:t xml:space="preserve">Integração do </w:t>
-            </w:r>
-            <w:proofErr w:type="spellStart"/>
-            <w:r>
-              <w:rPr>
-                <w:rFonts w:ascii="Arial" w:hAnsi="Arial" w:cs="Arial"/>
-                <w:color w:val="000000"/>
-                <w:sz w:val="22"/>
-                <w:szCs w:val="22"/>
-              </w:rPr>
-              <w:t>iText</w:t>
-            </w:r>
-            <w:proofErr w:type="spellEnd"/>
-            <w:r>
-              <w:rPr>
-                <w:rFonts w:ascii="Arial" w:hAnsi="Arial" w:cs="Arial"/>
-                <w:color w:val="000000"/>
-                <w:sz w:val="22"/>
-                <w:szCs w:val="22"/>
-              </w:rPr>
-              <w:t xml:space="preserve"> PDF, Tom </w:t>
-            </w:r>
-            <w:proofErr w:type="spellStart"/>
-            <w:r>
-              <w:rPr>
-                <w:rFonts w:ascii="Arial" w:hAnsi="Arial" w:cs="Arial"/>
-                <w:color w:val="000000"/>
-                <w:sz w:val="22"/>
-                <w:szCs w:val="22"/>
-              </w:rPr>
-              <w:t>Select</w:t>
-            </w:r>
-            <w:proofErr w:type="spellEnd"/>
-            <w:r>
-              <w:rPr>
-                <w:rFonts w:ascii="Arial" w:hAnsi="Arial" w:cs="Arial"/>
-                <w:color w:val="000000"/>
-                <w:sz w:val="22"/>
-                <w:szCs w:val="22"/>
-              </w:rPr>
-              <w:t>, testes de consistência e homologação.</w:t>
+              <w:t>Integração do iText PDF, Tom Select, testes de consistência e homologação.</w:t>
             </w:r>
           </w:p>
         </w:tc>
@@ -11552,39 +10930,7 @@
           <w:rFonts w:ascii="Arial" w:hAnsi="Arial" w:cs="Arial"/>
           <w:color w:val="000000"/>
         </w:rPr>
-        <w:t xml:space="preserve">Descrição dos Procedimentos: O levantamento foi conduzido por meio da verificação sistemática de documentos comerciais reais e da observação do cotidiano da loja </w:t>
-      </w:r>
-      <w:proofErr w:type="spellStart"/>
-      <w:r>
-        <w:rPr>
-          <w:rFonts w:ascii="Arial" w:hAnsi="Arial" w:cs="Arial"/>
-          <w:color w:val="000000"/>
-        </w:rPr>
-        <w:t>Prototech</w:t>
-      </w:r>
-      <w:proofErr w:type="spellEnd"/>
-      <w:r>
-        <w:rPr>
-          <w:rFonts w:ascii="Arial" w:hAnsi="Arial" w:cs="Arial"/>
-          <w:color w:val="000000"/>
-        </w:rPr>
-        <w:t xml:space="preserve">, visando </w:t>
-      </w:r>
-      <w:proofErr w:type="spellStart"/>
-      <w:r>
-        <w:rPr>
-          <w:rFonts w:ascii="Arial" w:hAnsi="Arial" w:cs="Arial"/>
-          <w:color w:val="000000"/>
-        </w:rPr>
-        <w:t>mepear</w:t>
-      </w:r>
-      <w:proofErr w:type="spellEnd"/>
-      <w:r>
-        <w:rPr>
-          <w:rFonts w:ascii="Arial" w:hAnsi="Arial" w:cs="Arial"/>
-          <w:color w:val="000000"/>
-        </w:rPr>
-        <w:t xml:space="preserve"> o fluxo passo a passo dos processos de negócio focados em suprimentos de vendas. </w:t>
+        <w:t xml:space="preserve">Descrição dos Procedimentos: O levantamento foi conduzido por meio da verificação sistemática de documentos comerciais reais e da observação do cotidiano da loja Prototech, visando mepear o fluxo passo a passo dos processos de negócio focados em suprimentos de vendas. </w:t>
       </w:r>
     </w:p>
     <w:p>
@@ -14806,6 +14152,7 @@
   <w:style w:type="character" w:default="1" w:styleId="Fontepargpadro">
     <w:name w:val="Default Paragraph Font"/>
     <w:uiPriority w:val="1"/>
+    <w:semiHidden/>
     <w:unhideWhenUsed/>
   </w:style>
   <w:style w:type="table" w:default="1" w:styleId="Tabelanormal">

</xml_diff>

<commit_message>
Atualizando documento versao 7.0
</commit_message>
<xml_diff>
--- a/doc/[ORIGINAL] DRS Modelo Generalista 01.docx
+++ b/doc/[ORIGINAL] DRS Modelo Generalista 01.docx
@@ -329,11 +329,19 @@
           <w:rFonts w:ascii="Arial" w:eastAsia="Arial" w:hAnsi="Arial" w:cs="Arial"/>
         </w:rPr>
       </w:pPr>
-      <w:r>
-        <w:rPr>
-          <w:rFonts w:ascii="Arial" w:eastAsia="Arial" w:hAnsi="Arial" w:cs="Arial"/>
-        </w:rPr>
-        <w:t>Izhac Nylton Silva Santos</w:t>
+      <w:proofErr w:type="spellStart"/>
+      <w:r>
+        <w:rPr>
+          <w:rFonts w:ascii="Arial" w:eastAsia="Arial" w:hAnsi="Arial" w:cs="Arial"/>
+        </w:rPr>
+        <w:t>Izhac</w:t>
+      </w:r>
+      <w:proofErr w:type="spellEnd"/>
+      <w:r>
+        <w:rPr>
+          <w:rFonts w:ascii="Arial" w:eastAsia="Arial" w:hAnsi="Arial" w:cs="Arial"/>
+        </w:rPr>
+        <w:t xml:space="preserve"> Nylton Silva Santos</w:t>
       </w:r>
     </w:p>
     <w:p>
@@ -1107,7 +1115,23 @@
                 <w:rFonts w:ascii="Arial" w:hAnsi="Arial" w:cs="Arial"/>
                 <w:color w:val="000000"/>
               </w:rPr>
-              <w:t xml:space="preserve">Refinamento final, exportação em PDF, Tom Select e casos de uso completos. </w:t>
+              <w:t xml:space="preserve">Refinamento final, exportação em PDF, Tom </w:t>
+            </w:r>
+            <w:proofErr w:type="spellStart"/>
+            <w:r>
+              <w:rPr>
+                <w:rFonts w:ascii="Arial" w:hAnsi="Arial" w:cs="Arial"/>
+                <w:color w:val="000000"/>
+              </w:rPr>
+              <w:t>Select</w:t>
+            </w:r>
+            <w:proofErr w:type="spellEnd"/>
+            <w:r>
+              <w:rPr>
+                <w:rFonts w:ascii="Arial" w:hAnsi="Arial" w:cs="Arial"/>
+                <w:color w:val="000000"/>
+              </w:rPr>
+              <w:t xml:space="preserve"> e casos de uso completos. </w:t>
             </w:r>
           </w:p>
         </w:tc>
@@ -1320,117 +1344,33 @@
           <w:pPr>
             <w:pStyle w:val="CabealhodoSumrio"/>
             <w:rPr>
-              <w:rFonts w:ascii="Arial" w:hAnsi="Arial" w:cs="Arial"/>
               <w:sz w:val="24"/>
               <w:szCs w:val="24"/>
             </w:rPr>
           </w:pPr>
           <w:r>
             <w:rPr>
-              <w:rFonts w:ascii="Arial" w:hAnsi="Arial" w:cs="Arial"/>
               <w:sz w:val="24"/>
               <w:szCs w:val="24"/>
             </w:rPr>
             <w:t>Sumário</w:t>
           </w:r>
-        </w:p>
-        <w:p>
-          <w:pPr>
-            <w:pStyle w:val="Sumrio2"/>
-            <w:tabs>
-              <w:tab w:val="right" w:leader="dot" w:pos="9830"/>
-            </w:tabs>
-            <w:rPr>
-              <w:rFonts w:ascii="Arial" w:eastAsiaTheme="minorEastAsia" w:hAnsi="Arial" w:cs="Arial"/>
-              <w:smallCaps w:val="0"/>
-              <w:noProof/>
-              <w:kern w:val="2"/>
-              <w14:ligatures w14:val="standardContextual"/>
-            </w:rPr>
-          </w:pPr>
           <w:r>
             <w:rPr>
-              <w:rFonts w:ascii="Arial" w:hAnsi="Arial" w:cs="Arial"/>
+              <w:smallCaps/>
             </w:rPr>
             <w:fldChar w:fldCharType="begin"/>
           </w:r>
           <w:r>
-            <w:rPr>
-              <w:rFonts w:ascii="Arial" w:hAnsi="Arial" w:cs="Arial"/>
-            </w:rPr>
             <w:instrText xml:space="preserve"> TOC \o "1-3" \h \z \u </w:instrText>
           </w:r>
           <w:r>
             <w:rPr>
-              <w:rFonts w:ascii="Arial" w:hAnsi="Arial" w:cs="Arial"/>
+              <w:smallCaps/>
             </w:rPr>
             <w:fldChar w:fldCharType="separate"/>
           </w:r>
-          <w:hyperlink w:anchor="_Toc238480093" w:history="1">
-            <w:r>
-              <w:rPr>
-                <w:rStyle w:val="Hyperlink"/>
-                <w:rFonts w:ascii="Arial" w:hAnsi="Arial" w:cs="Arial"/>
-                <w:noProof/>
-              </w:rPr>
-              <w:t>Versão &lt;5.0&gt;</w:t>
-            </w:r>
-            <w:r>
-              <w:rPr>
-                <w:rFonts w:ascii="Arial" w:hAnsi="Arial" w:cs="Arial"/>
-                <w:noProof/>
-                <w:webHidden/>
-              </w:rPr>
-              <w:tab/>
-            </w:r>
-            <w:r>
-              <w:rPr>
-                <w:rFonts w:ascii="Arial" w:hAnsi="Arial" w:cs="Arial"/>
-                <w:noProof/>
-                <w:webHidden/>
-              </w:rPr>
-              <w:fldChar w:fldCharType="begin"/>
-            </w:r>
-            <w:r>
-              <w:rPr>
-                <w:rFonts w:ascii="Arial" w:hAnsi="Arial" w:cs="Arial"/>
-                <w:noProof/>
-                <w:webHidden/>
-              </w:rPr>
-              <w:instrText xml:space="preserve"> PAGEREF _Toc238480093 \h </w:instrText>
-            </w:r>
-            <w:r>
-              <w:rPr>
-                <w:rFonts w:ascii="Arial" w:hAnsi="Arial" w:cs="Arial"/>
-                <w:noProof/>
-                <w:webHidden/>
-              </w:rPr>
-            </w:r>
-            <w:r>
-              <w:rPr>
-                <w:rFonts w:ascii="Arial" w:hAnsi="Arial" w:cs="Arial"/>
-                <w:noProof/>
-                <w:webHidden/>
-              </w:rPr>
-              <w:fldChar w:fldCharType="separate"/>
-            </w:r>
-            <w:r>
-              <w:rPr>
-                <w:rFonts w:ascii="Arial" w:hAnsi="Arial" w:cs="Arial"/>
-                <w:noProof/>
-                <w:webHidden/>
-              </w:rPr>
-              <w:t>0</w:t>
-            </w:r>
-            <w:r>
-              <w:rPr>
-                <w:rFonts w:ascii="Arial" w:hAnsi="Arial" w:cs="Arial"/>
-                <w:noProof/>
-                <w:webHidden/>
-              </w:rPr>
-              <w:fldChar w:fldCharType="end"/>
-            </w:r>
-          </w:hyperlink>
+          <w:hyperlink w:anchor="_Toc238480093" w:history="1"/>
         </w:p>
         <w:p>
           <w:pPr>
@@ -3768,7 +3708,7 @@
                 <w:noProof/>
                 <w:webHidden/>
               </w:rPr>
-              <w:t>9</w:t>
+              <w:t>11</w:t>
             </w:r>
             <w:r>
               <w:rPr>
@@ -3871,7 +3811,7 @@
                 <w:noProof/>
                 <w:webHidden/>
               </w:rPr>
-              <w:t>10</w:t>
+              <w:t>11</w:t>
             </w:r>
             <w:r>
               <w:rPr>
@@ -3974,7 +3914,7 @@
                 <w:noProof/>
                 <w:webHidden/>
               </w:rPr>
-              <w:t>11</w:t>
+              <w:t>12</w:t>
             </w:r>
             <w:r>
               <w:rPr>
@@ -4077,7 +4017,7 @@
                 <w:noProof/>
                 <w:webHidden/>
               </w:rPr>
-              <w:t>11</w:t>
+              <w:t>13</w:t>
             </w:r>
             <w:r>
               <w:rPr>
@@ -4115,7 +4055,11 @@
       </w:r>
       <w:bookmarkEnd w:id="2"/>
     </w:p>
-    <w:p/>
+    <w:p>
+      <w:pPr>
+        <w:jc w:val="both"/>
+      </w:pPr>
+    </w:p>
     <w:p>
       <w:pPr>
         <w:pStyle w:val="Ttulo1"/>
@@ -4127,6 +4071,9 @@
       <w:bookmarkEnd w:id="3"/>
     </w:p>
     <w:p>
+      <w:pPr>
+        <w:jc w:val="both"/>
+      </w:pPr>
       <w:bookmarkStart w:id="4" w:name="_heading=h.aol35znlb0lm" w:colFirst="0" w:colLast="0"/>
       <w:bookmarkEnd w:id="4"/>
       <w:r>
@@ -4153,7 +4100,11 @@
         <w:t xml:space="preserve"> </w:t>
       </w:r>
     </w:p>
-    <w:p/>
+    <w:p>
+      <w:pPr>
+        <w:jc w:val="both"/>
+      </w:pPr>
+    </w:p>
     <w:p>
       <w:pPr>
         <w:pStyle w:val="Ttulo1"/>
@@ -4167,20 +4118,36 @@
     <w:p>
       <w:pPr>
         <w:spacing w:before="240" w:after="240"/>
-        <w:rPr>
-          <w:rFonts w:ascii="Arial" w:eastAsia="Arial" w:hAnsi="Arial" w:cs="Arial"/>
-        </w:rPr>
-      </w:pPr>
-      <w:r>
-        <w:rPr>
-          <w:rFonts w:ascii="Arial" w:eastAsia="Arial" w:hAnsi="Arial" w:cs="Arial"/>
-        </w:rPr>
-        <w:t>Sistema de Controle de Clientes e pedidos (SCCP – ProtoTech ERP)</w:t>
+        <w:jc w:val="both"/>
+        <w:rPr>
+          <w:rFonts w:ascii="Arial" w:eastAsia="Arial" w:hAnsi="Arial" w:cs="Arial"/>
+        </w:rPr>
+      </w:pPr>
+      <w:r>
+        <w:rPr>
+          <w:rFonts w:ascii="Arial" w:eastAsia="Arial" w:hAnsi="Arial" w:cs="Arial"/>
+        </w:rPr>
+        <w:t xml:space="preserve">Sistema de Controle de Clientes e pedidos (SCCP – </w:t>
+      </w:r>
+      <w:proofErr w:type="spellStart"/>
+      <w:r>
+        <w:rPr>
+          <w:rFonts w:ascii="Arial" w:eastAsia="Arial" w:hAnsi="Arial" w:cs="Arial"/>
+        </w:rPr>
+        <w:t>ProtoTech</w:t>
+      </w:r>
+      <w:proofErr w:type="spellEnd"/>
+      <w:r>
+        <w:rPr>
+          <w:rFonts w:ascii="Arial" w:eastAsia="Arial" w:hAnsi="Arial" w:cs="Arial"/>
+        </w:rPr>
+        <w:t xml:space="preserve"> ERP)</w:t>
       </w:r>
     </w:p>
     <w:p>
       <w:pPr>
         <w:spacing w:before="240" w:after="240"/>
+        <w:jc w:val="both"/>
         <w:rPr>
           <w:rFonts w:ascii="Arial" w:eastAsia="Arial" w:hAnsi="Arial" w:cs="Arial"/>
         </w:rPr>
@@ -4198,22 +4165,22 @@
           <w:ilvl w:val="0"/>
           <w:numId w:val="2"/>
         </w:numPr>
-        <w:spacing w:before="240"/>
-        <w:rPr>
-          <w:rFonts w:ascii="Arial" w:eastAsia="Arial" w:hAnsi="Arial" w:cs="Arial"/>
-        </w:rPr>
-      </w:pPr>
-      <w:r>
-        <w:rPr>
-          <w:rFonts w:ascii="Arial" w:eastAsia="Arial" w:hAnsi="Arial" w:cs="Arial"/>
-        </w:rPr>
-        <w:t>Módulo de Autenticação</w:t>
-      </w:r>
-      <w:r>
-        <w:rPr>
-          <w:rFonts w:ascii="Arial" w:eastAsia="Arial" w:hAnsi="Arial" w:cs="Arial"/>
-        </w:rPr>
-        <w:t xml:space="preserve"> Administrativa</w:t>
+        <w:jc w:val="both"/>
+        <w:rPr>
+          <w:rFonts w:ascii="Arial" w:eastAsia="Arial" w:hAnsi="Arial" w:cs="Arial"/>
+        </w:rPr>
+      </w:pPr>
+      <w:r>
+        <w:rPr>
+          <w:rFonts w:ascii="Arial" w:eastAsia="Arial" w:hAnsi="Arial" w:cs="Arial"/>
+        </w:rPr>
+        <w:t>Módulo de</w:t>
+      </w:r>
+      <w:r>
+        <w:rPr>
+          <w:rFonts w:ascii="Arial" w:eastAsia="Arial" w:hAnsi="Arial" w:cs="Arial"/>
+        </w:rPr>
+        <w:t xml:space="preserve"> Gestão de Clientes</w:t>
       </w:r>
       <w:r>
         <w:rPr>
@@ -4228,21 +4195,22 @@
           <w:ilvl w:val="0"/>
           <w:numId w:val="2"/>
         </w:numPr>
-        <w:rPr>
-          <w:rFonts w:ascii="Arial" w:eastAsia="Arial" w:hAnsi="Arial" w:cs="Arial"/>
-        </w:rPr>
-      </w:pPr>
-      <w:r>
-        <w:rPr>
-          <w:rFonts w:ascii="Arial" w:eastAsia="Arial" w:hAnsi="Arial" w:cs="Arial"/>
-        </w:rPr>
-        <w:t>Módulo de</w:t>
-      </w:r>
-      <w:r>
-        <w:rPr>
-          <w:rFonts w:ascii="Arial" w:eastAsia="Arial" w:hAnsi="Arial" w:cs="Arial"/>
-        </w:rPr>
-        <w:t xml:space="preserve"> Gestão de Clientes</w:t>
+        <w:jc w:val="both"/>
+        <w:rPr>
+          <w:rFonts w:ascii="Arial" w:eastAsia="Arial" w:hAnsi="Arial" w:cs="Arial"/>
+        </w:rPr>
+      </w:pPr>
+      <w:r>
+        <w:rPr>
+          <w:rFonts w:ascii="Arial" w:eastAsia="Arial" w:hAnsi="Arial" w:cs="Arial"/>
+        </w:rPr>
+        <w:t>Módulo de Categorias</w:t>
+      </w:r>
+      <w:r>
+        <w:rPr>
+          <w:rFonts w:ascii="Arial" w:eastAsia="Arial" w:hAnsi="Arial" w:cs="Arial"/>
+        </w:rPr>
+        <w:t xml:space="preserve"> de Produtos</w:t>
       </w:r>
       <w:r>
         <w:rPr>
@@ -4257,27 +4225,28 @@
           <w:ilvl w:val="0"/>
           <w:numId w:val="2"/>
         </w:numPr>
-        <w:rPr>
-          <w:rFonts w:ascii="Arial" w:eastAsia="Arial" w:hAnsi="Arial" w:cs="Arial"/>
-        </w:rPr>
-      </w:pPr>
-      <w:r>
-        <w:rPr>
-          <w:rFonts w:ascii="Arial" w:eastAsia="Arial" w:hAnsi="Arial" w:cs="Arial"/>
-        </w:rPr>
-        <w:t>Módulo de Categorias</w:t>
-      </w:r>
-      <w:r>
-        <w:rPr>
-          <w:rFonts w:ascii="Arial" w:eastAsia="Arial" w:hAnsi="Arial" w:cs="Arial"/>
-        </w:rPr>
-        <w:t xml:space="preserve"> de Produtos</w:t>
-      </w:r>
-      <w:r>
-        <w:rPr>
-          <w:rFonts w:ascii="Arial" w:eastAsia="Arial" w:hAnsi="Arial" w:cs="Arial"/>
-        </w:rPr>
-        <w:t>;</w:t>
+        <w:jc w:val="both"/>
+        <w:rPr>
+          <w:rFonts w:ascii="Arial" w:eastAsia="Arial" w:hAnsi="Arial" w:cs="Arial"/>
+        </w:rPr>
+      </w:pPr>
+      <w:r>
+        <w:rPr>
+          <w:rFonts w:ascii="Arial" w:eastAsia="Arial" w:hAnsi="Arial" w:cs="Arial"/>
+        </w:rPr>
+        <w:t xml:space="preserve">Módulo de </w:t>
+      </w:r>
+      <w:r>
+        <w:rPr>
+          <w:rFonts w:ascii="Arial" w:eastAsia="Arial" w:hAnsi="Arial" w:cs="Arial"/>
+        </w:rPr>
+        <w:t xml:space="preserve">Catálogo de </w:t>
+      </w:r>
+      <w:r>
+        <w:rPr>
+          <w:rFonts w:ascii="Arial" w:eastAsia="Arial" w:hAnsi="Arial" w:cs="Arial"/>
+        </w:rPr>
+        <w:t>Produtos;</w:t>
       </w:r>
     </w:p>
     <w:p>
@@ -4286,6 +4255,7 @@
           <w:ilvl w:val="0"/>
           <w:numId w:val="2"/>
         </w:numPr>
+        <w:jc w:val="both"/>
         <w:rPr>
           <w:rFonts w:ascii="Arial" w:eastAsia="Arial" w:hAnsi="Arial" w:cs="Arial"/>
         </w:rPr>
@@ -4300,13 +4270,13 @@
         <w:rPr>
           <w:rFonts w:ascii="Arial" w:eastAsia="Arial" w:hAnsi="Arial" w:cs="Arial"/>
         </w:rPr>
-        <w:t xml:space="preserve">Catálogo de </w:t>
-      </w:r>
-      <w:r>
-        <w:rPr>
-          <w:rFonts w:ascii="Arial" w:eastAsia="Arial" w:hAnsi="Arial" w:cs="Arial"/>
-        </w:rPr>
-        <w:t>Produtos;</w:t>
+        <w:t>Controle de Estoque e Alertas Críticos</w:t>
+      </w:r>
+      <w:r>
+        <w:rPr>
+          <w:rFonts w:ascii="Arial" w:eastAsia="Arial" w:hAnsi="Arial" w:cs="Arial"/>
+        </w:rPr>
+        <w:t>;</w:t>
       </w:r>
     </w:p>
     <w:p>
@@ -4315,35 +4285,7 @@
           <w:ilvl w:val="0"/>
           <w:numId w:val="2"/>
         </w:numPr>
-        <w:rPr>
-          <w:rFonts w:ascii="Arial" w:eastAsia="Arial" w:hAnsi="Arial" w:cs="Arial"/>
-        </w:rPr>
-      </w:pPr>
-      <w:r>
-        <w:rPr>
-          <w:rFonts w:ascii="Arial" w:eastAsia="Arial" w:hAnsi="Arial" w:cs="Arial"/>
-        </w:rPr>
-        <w:t xml:space="preserve">Módulo de </w:t>
-      </w:r>
-      <w:r>
-        <w:rPr>
-          <w:rFonts w:ascii="Arial" w:eastAsia="Arial" w:hAnsi="Arial" w:cs="Arial"/>
-        </w:rPr>
-        <w:t>Controle de Estoque e Alertas Críticos</w:t>
-      </w:r>
-      <w:r>
-        <w:rPr>
-          <w:rFonts w:ascii="Arial" w:eastAsia="Arial" w:hAnsi="Arial" w:cs="Arial"/>
-        </w:rPr>
-        <w:t>;</w:t>
-      </w:r>
-    </w:p>
-    <w:p>
-      <w:pPr>
-        <w:numPr>
-          <w:ilvl w:val="0"/>
-          <w:numId w:val="2"/>
-        </w:numPr>
+        <w:jc w:val="both"/>
         <w:rPr>
           <w:rFonts w:ascii="Arial" w:eastAsia="Arial" w:hAnsi="Arial" w:cs="Arial"/>
         </w:rPr>
@@ -4374,6 +4316,7 @@
           <w:numId w:val="2"/>
         </w:numPr>
         <w:spacing w:after="240"/>
+        <w:jc w:val="both"/>
         <w:rPr>
           <w:rFonts w:ascii="Arial" w:eastAsia="Arial" w:hAnsi="Arial" w:cs="Arial"/>
         </w:rPr>
@@ -4400,6 +4343,7 @@
     <w:p>
       <w:pPr>
         <w:spacing w:line="360" w:lineRule="auto"/>
+        <w:jc w:val="both"/>
         <w:rPr>
           <w:rFonts w:ascii="Arial" w:eastAsia="Arial" w:hAnsi="Arial" w:cs="Arial"/>
         </w:rPr>
@@ -4413,7 +4357,7 @@
           <w:numId w:val="18"/>
         </w:numPr>
         <w:spacing w:line="360" w:lineRule="auto"/>
-        <w:jc w:val="left"/>
+        <w:jc w:val="both"/>
         <w:rPr>
           <w:sz w:val="24"/>
           <w:szCs w:val="24"/>
@@ -4458,15 +4402,12 @@
     <w:p>
       <w:pPr>
         <w:ind w:left="720"/>
+        <w:jc w:val="both"/>
       </w:pPr>
     </w:p>
     <w:p>
       <w:pPr>
         <w:pStyle w:val="Ttulo1"/>
-        <w:numPr>
-          <w:ilvl w:val="1"/>
-          <w:numId w:val="18"/>
-        </w:numPr>
       </w:pPr>
       <w:bookmarkStart w:id="6" w:name="_Toc238480097"/>
       <w:r>
@@ -4498,20 +4439,11 @@
     <w:p>
       <w:pPr>
         <w:pStyle w:val="Ttulo1"/>
-        <w:numPr>
-          <w:ilvl w:val="0"/>
-          <w:numId w:val="0"/>
-        </w:numPr>
-        <w:ind w:left="720"/>
       </w:pPr>
     </w:p>
     <w:p>
       <w:pPr>
         <w:pStyle w:val="Ttulo1"/>
-        <w:numPr>
-          <w:ilvl w:val="1"/>
-          <w:numId w:val="18"/>
-        </w:numPr>
       </w:pPr>
       <w:bookmarkStart w:id="7" w:name="_Toc238480098"/>
       <w:r>
@@ -4562,7 +4494,7 @@
                 <w:between w:val="nil"/>
               </w:pBdr>
               <w:spacing w:before="40" w:after="40"/>
-              <w:jc w:val="center"/>
+              <w:jc w:val="both"/>
               <w:rPr>
                 <w:rFonts w:ascii="Arial" w:eastAsia="Arial" w:hAnsi="Arial" w:cs="Arial"/>
                 <w:b/>
@@ -4602,7 +4534,7 @@
                 <w:between w:val="nil"/>
               </w:pBdr>
               <w:spacing w:before="40" w:after="40"/>
-              <w:jc w:val="center"/>
+              <w:jc w:val="both"/>
               <w:rPr>
                 <w:rFonts w:ascii="Arial" w:eastAsia="Arial" w:hAnsi="Arial" w:cs="Arial"/>
                 <w:b/>
@@ -4641,7 +4573,7 @@
                 <w:between w:val="nil"/>
               </w:pBdr>
               <w:spacing w:before="40" w:after="40"/>
-              <w:jc w:val="center"/>
+              <w:jc w:val="both"/>
               <w:rPr>
                 <w:rFonts w:ascii="Arial" w:eastAsia="Arial" w:hAnsi="Arial" w:cs="Arial"/>
                 <w:b/>
@@ -4955,11 +4887,33 @@
                 <w:rFonts w:ascii="Arial" w:eastAsia="Arial" w:hAnsi="Arial" w:cs="Arial"/>
               </w:rPr>
             </w:pPr>
+            <w:proofErr w:type="spellStart"/>
             <w:r>
               <w:rPr>
                 <w:rFonts w:ascii="Arial" w:eastAsia="Arial" w:hAnsi="Arial" w:cs="Arial"/>
               </w:rPr>
-              <w:t xml:space="preserve">Create, Read, Update e Delete. </w:t>
+              <w:t>Create</w:t>
+            </w:r>
+            <w:proofErr w:type="spellEnd"/>
+            <w:r>
+              <w:rPr>
+                <w:rFonts w:ascii="Arial" w:eastAsia="Arial" w:hAnsi="Arial" w:cs="Arial"/>
+              </w:rPr>
+              <w:t xml:space="preserve">, </w:t>
+            </w:r>
+            <w:proofErr w:type="spellStart"/>
+            <w:r>
+              <w:rPr>
+                <w:rFonts w:ascii="Arial" w:eastAsia="Arial" w:hAnsi="Arial" w:cs="Arial"/>
+              </w:rPr>
+              <w:t>Read</w:t>
+            </w:r>
+            <w:proofErr w:type="spellEnd"/>
+            <w:r>
+              <w:rPr>
+                <w:rFonts w:ascii="Arial" w:eastAsia="Arial" w:hAnsi="Arial" w:cs="Arial"/>
+              </w:rPr>
+              <w:t xml:space="preserve">, Update e Delete. </w:t>
             </w:r>
             <w:r>
               <w:rPr>
@@ -5185,8 +5139,30 @@
               <w:rPr>
                 <w:rFonts w:ascii="Arial" w:eastAsia="Arial" w:hAnsi="Arial" w:cs="Arial"/>
               </w:rPr>
-              <w:t>Model-View-Controller</w:t>
-            </w:r>
+              <w:t>Model-</w:t>
+            </w:r>
+            <w:proofErr w:type="spellStart"/>
+            <w:r>
+              <w:rPr>
+                <w:rFonts w:ascii="Arial" w:eastAsia="Arial" w:hAnsi="Arial" w:cs="Arial"/>
+              </w:rPr>
+              <w:t>View</w:t>
+            </w:r>
+            <w:proofErr w:type="spellEnd"/>
+            <w:r>
+              <w:rPr>
+                <w:rFonts w:ascii="Arial" w:eastAsia="Arial" w:hAnsi="Arial" w:cs="Arial"/>
+              </w:rPr>
+              <w:t>-</w:t>
+            </w:r>
+            <w:proofErr w:type="spellStart"/>
+            <w:r>
+              <w:rPr>
+                <w:rFonts w:ascii="Arial" w:eastAsia="Arial" w:hAnsi="Arial" w:cs="Arial"/>
+              </w:rPr>
+              <w:t>Controller</w:t>
+            </w:r>
+            <w:proofErr w:type="spellEnd"/>
             <w:r>
               <w:rPr>
                 <w:rFonts w:ascii="Arial" w:eastAsia="Arial" w:hAnsi="Arial" w:cs="Arial"/>
@@ -5305,17 +5281,39 @@
                 <w:rFonts w:ascii="Arial" w:eastAsia="Arial" w:hAnsi="Arial" w:cs="Arial"/>
               </w:rPr>
             </w:pPr>
+            <w:proofErr w:type="spellStart"/>
             <w:r>
               <w:rPr>
                 <w:rFonts w:ascii="Arial" w:eastAsia="Arial" w:hAnsi="Arial" w:cs="Arial"/>
               </w:rPr>
-              <w:t>Object-Relational Mapping</w:t>
-            </w:r>
+              <w:t>Object-Relational</w:t>
+            </w:r>
+            <w:proofErr w:type="spellEnd"/>
             <w:r>
               <w:rPr>
                 <w:rFonts w:ascii="Arial" w:eastAsia="Arial" w:hAnsi="Arial" w:cs="Arial"/>
               </w:rPr>
-              <w:t xml:space="preserve"> (Mapeamento Objeto-Relacional via Hibernate/JPA)</w:t>
+              <w:t xml:space="preserve"> Mapping</w:t>
+            </w:r>
+            <w:r>
+              <w:rPr>
+                <w:rFonts w:ascii="Arial" w:eastAsia="Arial" w:hAnsi="Arial" w:cs="Arial"/>
+              </w:rPr>
+              <w:t xml:space="preserve"> (Mapeamento Objeto-Relacional via </w:t>
+            </w:r>
+            <w:proofErr w:type="spellStart"/>
+            <w:r>
+              <w:rPr>
+                <w:rFonts w:ascii="Arial" w:eastAsia="Arial" w:hAnsi="Arial" w:cs="Arial"/>
+              </w:rPr>
+              <w:t>Hibernate</w:t>
+            </w:r>
+            <w:proofErr w:type="spellEnd"/>
+            <w:r>
+              <w:rPr>
+                <w:rFonts w:ascii="Arial" w:eastAsia="Arial" w:hAnsi="Arial" w:cs="Arial"/>
+              </w:rPr>
+              <w:t>/JPA)</w:t>
             </w:r>
           </w:p>
         </w:tc>
@@ -5417,11 +5415,33 @@
                 <w:rFonts w:ascii="Arial" w:eastAsia="Arial" w:hAnsi="Arial" w:cs="Arial"/>
               </w:rPr>
             </w:pPr>
+            <w:proofErr w:type="spellStart"/>
             <w:r>
               <w:rPr>
                 <w:rFonts w:ascii="Arial" w:eastAsia="Arial" w:hAnsi="Arial" w:cs="Arial"/>
               </w:rPr>
-              <w:t>Portable Document Format (Formato de documento para recibos)</w:t>
+              <w:t>Portable</w:t>
+            </w:r>
+            <w:proofErr w:type="spellEnd"/>
+            <w:r>
+              <w:rPr>
+                <w:rFonts w:ascii="Arial" w:eastAsia="Arial" w:hAnsi="Arial" w:cs="Arial"/>
+              </w:rPr>
+              <w:t xml:space="preserve"> </w:t>
+            </w:r>
+            <w:proofErr w:type="spellStart"/>
+            <w:r>
+              <w:rPr>
+                <w:rFonts w:ascii="Arial" w:eastAsia="Arial" w:hAnsi="Arial" w:cs="Arial"/>
+              </w:rPr>
+              <w:t>Document</w:t>
+            </w:r>
+            <w:proofErr w:type="spellEnd"/>
+            <w:r>
+              <w:rPr>
+                <w:rFonts w:ascii="Arial" w:eastAsia="Arial" w:hAnsi="Arial" w:cs="Arial"/>
+              </w:rPr>
+              <w:t xml:space="preserve"> Format (Formato de documento para recibos)</w:t>
             </w:r>
           </w:p>
         </w:tc>
@@ -5431,20 +5451,11 @@
     <w:p>
       <w:pPr>
         <w:pStyle w:val="Ttulo1"/>
-        <w:numPr>
-          <w:ilvl w:val="0"/>
-          <w:numId w:val="0"/>
-        </w:numPr>
-        <w:ind w:left="720"/>
       </w:pPr>
     </w:p>
     <w:p>
       <w:pPr>
         <w:pStyle w:val="Ttulo1"/>
-        <w:numPr>
-          <w:ilvl w:val="1"/>
-          <w:numId w:val="18"/>
-        </w:numPr>
       </w:pPr>
       <w:bookmarkStart w:id="8" w:name="_Toc238480099"/>
       <w:r>
@@ -5456,11 +5467,28 @@
       </w:r>
     </w:p>
     <w:p>
-      <w:r>
-        <w:rPr>
-          <w:rFonts w:ascii="Arial" w:eastAsia="Arial" w:hAnsi="Arial" w:cs="Arial"/>
-        </w:rPr>
-        <w:t>Análise de documentos comerciais e mapeamento dos processos de negócio de suprimentos de vendas da loja Prototech. Foram identificadas as regras de entrada/saída, integridade referencial, concorrência e restrições de estoque mínimo.</w:t>
+      <w:pPr>
+        <w:jc w:val="both"/>
+      </w:pPr>
+      <w:r>
+        <w:rPr>
+          <w:rFonts w:ascii="Arial" w:eastAsia="Arial" w:hAnsi="Arial" w:cs="Arial"/>
+        </w:rPr>
+        <w:t xml:space="preserve">Análise de documentos comerciais e mapeamento dos processos de negócio de suprimentos de vendas da loja </w:t>
+      </w:r>
+      <w:proofErr w:type="spellStart"/>
+      <w:r>
+        <w:rPr>
+          <w:rFonts w:ascii="Arial" w:eastAsia="Arial" w:hAnsi="Arial" w:cs="Arial"/>
+        </w:rPr>
+        <w:t>Prototech</w:t>
+      </w:r>
+      <w:proofErr w:type="spellEnd"/>
+      <w:r>
+        <w:rPr>
+          <w:rFonts w:ascii="Arial" w:eastAsia="Arial" w:hAnsi="Arial" w:cs="Arial"/>
+        </w:rPr>
+        <w:t>. Foram identificadas as regras de entrada/saída, integridade referencial, concorrência e restrições de estoque mínimo.</w:t>
       </w:r>
     </w:p>
     <w:p>
@@ -5484,27 +5512,21 @@
     <w:p>
       <w:pPr>
         <w:pStyle w:val="Ttulo1"/>
-        <w:rPr>
-          <w:szCs w:val="24"/>
-        </w:rPr>
       </w:pPr>
       <w:bookmarkStart w:id="9" w:name="_Toc238480100"/>
       <w:r>
-        <w:rPr>
-          <w:szCs w:val="24"/>
-        </w:rPr>
         <w:t>Descrição geral do produto</w:t>
       </w:r>
       <w:bookmarkEnd w:id="9"/>
     </w:p>
-    <w:p/>
+    <w:p>
+      <w:pPr>
+        <w:jc w:val="both"/>
+      </w:pPr>
+    </w:p>
     <w:p>
       <w:pPr>
         <w:pStyle w:val="Ttulo1"/>
-        <w:numPr>
-          <w:ilvl w:val="1"/>
-          <w:numId w:val="18"/>
-        </w:numPr>
       </w:pPr>
       <w:bookmarkStart w:id="10" w:name="_Toc238480101"/>
       <w:r>
@@ -5526,7 +5548,14 @@
         <w:rPr>
           <w:rFonts w:ascii="Arial" w:eastAsia="Arial" w:hAnsi="Arial" w:cs="Arial"/>
         </w:rPr>
-        <w:t>O software opera sob arquitetura cliente-servidos web baseada no framework Spring Boot, utilizando o motor de t</w:t>
+        <w:t xml:space="preserve">O software opera sob arquitetura cliente-servidos web baseada no framework Spring Boot, utilizando o motor de </w:t>
+      </w:r>
+      <w:proofErr w:type="spellStart"/>
+      <w:r>
+        <w:rPr>
+          <w:rFonts w:ascii="Arial" w:eastAsia="Arial" w:hAnsi="Arial" w:cs="Arial"/>
+        </w:rPr>
+        <w:t>t</w:t>
       </w:r>
       <w:r>
         <w:rPr>
@@ -5538,49 +5567,59 @@
         <w:rPr>
           <w:rFonts w:ascii="Arial" w:eastAsia="Arial" w:hAnsi="Arial" w:cs="Arial"/>
         </w:rPr>
-        <w:t>mplates Thymeleaf com componentes visuais Bootstrap 5 e pesquisa dinâmica com Tom Select no lado cliente, persistindo os dados em banco relacional MySQL.</w:t>
-      </w:r>
-    </w:p>
-    <w:p>
-      <w:pPr>
-        <w:pBdr>
-          <w:top w:val="nil"/>
-          <w:left w:val="nil"/>
-          <w:bottom w:val="nil"/>
-          <w:right w:val="nil"/>
-          <w:between w:val="nil"/>
-        </w:pBdr>
-        <w:ind w:left="600"/>
-        <w:jc w:val="both"/>
-        <w:rPr>
-          <w:rFonts w:ascii="Arial" w:eastAsia="Arial" w:hAnsi="Arial" w:cs="Arial"/>
-          <w:sz w:val="20"/>
-          <w:szCs w:val="20"/>
-        </w:rPr>
-      </w:pPr>
-    </w:p>
-    <w:p>
-      <w:pPr>
-        <w:pBdr>
-          <w:top w:val="nil"/>
-          <w:left w:val="nil"/>
-          <w:bottom w:val="nil"/>
-          <w:right w:val="nil"/>
-          <w:between w:val="nil"/>
-        </w:pBdr>
-        <w:jc w:val="both"/>
-        <w:rPr>
-          <w:rFonts w:ascii="Arial" w:eastAsia="Arial" w:hAnsi="Arial" w:cs="Arial"/>
-          <w:color w:val="000000"/>
-          <w:sz w:val="20"/>
-          <w:szCs w:val="20"/>
-        </w:rPr>
-      </w:pPr>
-    </w:p>
-    <w:p>
-      <w:pPr>
-        <w:jc w:val="center"/>
-      </w:pPr>
+        <w:t>mplates</w:t>
+      </w:r>
+      <w:proofErr w:type="spellEnd"/>
+      <w:r>
+        <w:rPr>
+          <w:rFonts w:ascii="Arial" w:eastAsia="Arial" w:hAnsi="Arial" w:cs="Arial"/>
+        </w:rPr>
+        <w:t xml:space="preserve"> </w:t>
+      </w:r>
+      <w:proofErr w:type="spellStart"/>
+      <w:r>
+        <w:rPr>
+          <w:rFonts w:ascii="Arial" w:eastAsia="Arial" w:hAnsi="Arial" w:cs="Arial"/>
+        </w:rPr>
+        <w:t>Thymeleaf</w:t>
+      </w:r>
+      <w:proofErr w:type="spellEnd"/>
+      <w:r>
+        <w:rPr>
+          <w:rFonts w:ascii="Arial" w:eastAsia="Arial" w:hAnsi="Arial" w:cs="Arial"/>
+        </w:rPr>
+        <w:t xml:space="preserve"> com componentes visuais </w:t>
+      </w:r>
+      <w:proofErr w:type="spellStart"/>
+      <w:r>
+        <w:rPr>
+          <w:rFonts w:ascii="Arial" w:eastAsia="Arial" w:hAnsi="Arial" w:cs="Arial"/>
+        </w:rPr>
+        <w:t>Bootstrap</w:t>
+      </w:r>
+      <w:proofErr w:type="spellEnd"/>
+      <w:r>
+        <w:rPr>
+          <w:rFonts w:ascii="Arial" w:eastAsia="Arial" w:hAnsi="Arial" w:cs="Arial"/>
+        </w:rPr>
+        <w:t xml:space="preserve"> 5 e pesquisa dinâmica com Tom </w:t>
+      </w:r>
+      <w:proofErr w:type="spellStart"/>
+      <w:r>
+        <w:rPr>
+          <w:rFonts w:ascii="Arial" w:eastAsia="Arial" w:hAnsi="Arial" w:cs="Arial"/>
+        </w:rPr>
+        <w:t>Select</w:t>
+      </w:r>
+      <w:proofErr w:type="spellEnd"/>
+      <w:r>
+        <w:rPr>
+          <w:rFonts w:ascii="Arial" w:eastAsia="Arial" w:hAnsi="Arial" w:cs="Arial"/>
+        </w:rPr>
+        <w:t xml:space="preserve"> no lado cliente, persistindo os dados em banco relacional MySQL.</w:t>
+      </w:r>
+    </w:p>
+    <w:p>
       <w:r>
         <w:rPr>
           <w:noProof/>
@@ -5663,11 +5702,6 @@
     <w:p>
       <w:pPr>
         <w:pStyle w:val="Ttulo1"/>
-        <w:numPr>
-          <w:ilvl w:val="0"/>
-          <w:numId w:val="0"/>
-        </w:numPr>
-        <w:ind w:left="720" w:hanging="360"/>
       </w:pPr>
       <w:bookmarkStart w:id="11" w:name="_Toc238480102"/>
       <w:r>
@@ -5851,7 +5885,7 @@
                 <w:between w:val="nil"/>
               </w:pBdr>
               <w:spacing w:before="40" w:after="40"/>
-              <w:jc w:val="center"/>
+              <w:jc w:val="both"/>
               <w:rPr>
                 <w:rFonts w:ascii="Arial" w:eastAsia="Arial" w:hAnsi="Arial" w:cs="Arial"/>
                 <w:b/>
@@ -5880,6 +5914,7 @@
                 <w:between w:val="nil"/>
               </w:pBdr>
               <w:spacing w:before="40" w:after="40"/>
+              <w:jc w:val="both"/>
               <w:rPr>
                 <w:rFonts w:ascii="Arial" w:eastAsia="Arial" w:hAnsi="Arial" w:cs="Arial"/>
               </w:rPr>
@@ -5912,6 +5947,7 @@
                 <w:between w:val="nil"/>
               </w:pBdr>
               <w:spacing w:before="40" w:after="40"/>
+              <w:jc w:val="both"/>
               <w:rPr>
                 <w:rFonts w:ascii="Arial" w:eastAsia="Arial" w:hAnsi="Arial" w:cs="Arial"/>
               </w:rPr>
@@ -5950,7 +5986,7 @@
                 <w:between w:val="nil"/>
               </w:pBdr>
               <w:spacing w:before="40" w:after="40"/>
-              <w:jc w:val="center"/>
+              <w:jc w:val="both"/>
               <w:rPr>
                 <w:rFonts w:ascii="Arial" w:eastAsia="Arial" w:hAnsi="Arial" w:cs="Arial"/>
                 <w:b/>
@@ -5979,6 +6015,7 @@
                 <w:between w:val="nil"/>
               </w:pBdr>
               <w:spacing w:before="40" w:after="40"/>
+              <w:jc w:val="both"/>
               <w:rPr>
                 <w:rFonts w:ascii="Arial" w:eastAsia="Arial" w:hAnsi="Arial" w:cs="Arial"/>
               </w:rPr>
@@ -6011,6 +6048,7 @@
                 <w:between w:val="nil"/>
               </w:pBdr>
               <w:spacing w:before="40" w:after="40"/>
+              <w:jc w:val="both"/>
               <w:rPr>
                 <w:rFonts w:ascii="Arial" w:eastAsia="Arial" w:hAnsi="Arial" w:cs="Arial"/>
               </w:rPr>
@@ -6049,7 +6087,7 @@
                 <w:between w:val="nil"/>
               </w:pBdr>
               <w:spacing w:before="40" w:after="40"/>
-              <w:jc w:val="center"/>
+              <w:jc w:val="both"/>
               <w:rPr>
                 <w:rFonts w:ascii="Arial" w:eastAsia="Arial" w:hAnsi="Arial" w:cs="Arial"/>
                 <w:b/>
@@ -6078,6 +6116,7 @@
                 <w:between w:val="nil"/>
               </w:pBdr>
               <w:spacing w:before="40" w:after="40"/>
+              <w:jc w:val="both"/>
               <w:rPr>
                 <w:rFonts w:ascii="Arial" w:eastAsia="Arial" w:hAnsi="Arial" w:cs="Arial"/>
               </w:rPr>
@@ -6110,6 +6149,7 @@
                 <w:between w:val="nil"/>
               </w:pBdr>
               <w:spacing w:before="40" w:after="40"/>
+              <w:jc w:val="both"/>
               <w:rPr>
                 <w:rFonts w:ascii="Arial" w:eastAsia="Arial" w:hAnsi="Arial" w:cs="Arial"/>
               </w:rPr>
@@ -6118,7 +6158,21 @@
               <w:rPr>
                 <w:rFonts w:ascii="Arial" w:eastAsia="Arial" w:hAnsi="Arial" w:cs="Arial"/>
               </w:rPr>
-              <w:t>Banco de dados responsável pelo armazenamento persistente, execução de constraints e integridade das tabelas.</w:t>
+              <w:t xml:space="preserve">Banco de dados responsável pelo armazenamento persistente, execução de </w:t>
+            </w:r>
+            <w:proofErr w:type="spellStart"/>
+            <w:r>
+              <w:rPr>
+                <w:rFonts w:ascii="Arial" w:eastAsia="Arial" w:hAnsi="Arial" w:cs="Arial"/>
+              </w:rPr>
+              <w:t>constraints</w:t>
+            </w:r>
+            <w:proofErr w:type="spellEnd"/>
+            <w:r>
+              <w:rPr>
+                <w:rFonts w:ascii="Arial" w:eastAsia="Arial" w:hAnsi="Arial" w:cs="Arial"/>
+              </w:rPr>
+              <w:t xml:space="preserve"> e integridade das tabelas.</w:t>
             </w:r>
           </w:p>
         </w:tc>
@@ -6129,31 +6183,29 @@
         <w:tab/>
       </w:r>
     </w:p>
-    <w:p/>
+    <w:p>
+      <w:pPr>
+        <w:jc w:val="both"/>
+      </w:pPr>
+    </w:p>
     <w:p>
       <w:pPr>
         <w:pStyle w:val="Ttulo1"/>
-        <w:rPr>
-          <w:szCs w:val="24"/>
-        </w:rPr>
       </w:pPr>
       <w:bookmarkStart w:id="12" w:name="_Toc238480103"/>
       <w:r>
-        <w:rPr>
-          <w:szCs w:val="24"/>
-        </w:rPr>
         <w:t>Requisitos específicos</w:t>
       </w:r>
       <w:bookmarkEnd w:id="12"/>
     </w:p>
-    <w:p/>
+    <w:p>
+      <w:pPr>
+        <w:jc w:val="both"/>
+      </w:pPr>
+    </w:p>
     <w:p>
       <w:pPr>
         <w:pStyle w:val="Ttulo1"/>
-        <w:numPr>
-          <w:ilvl w:val="1"/>
-          <w:numId w:val="18"/>
-        </w:numPr>
       </w:pPr>
       <w:bookmarkStart w:id="13" w:name="_Toc238480104"/>
       <w:r>
@@ -6163,6 +6215,7 @@
     </w:p>
     <w:p>
       <w:pPr>
+        <w:jc w:val="both"/>
         <w:rPr>
           <w:rFonts w:ascii="Arial" w:eastAsia="Arial" w:hAnsi="Arial" w:cs="Arial"/>
           <w:color w:val="000000"/>
@@ -6171,6 +6224,7 @@
     </w:p>
     <w:p>
       <w:pPr>
+        <w:jc w:val="both"/>
         <w:rPr>
           <w:rFonts w:ascii="Arial" w:eastAsia="Arial" w:hAnsi="Arial" w:cs="Arial"/>
           <w:color w:val="000000"/>
@@ -6184,14 +6238,14 @@
         <w:t>Identificadores: [RF XX] para requisitos funcionais e [RNF XX] para não funcionais.</w:t>
       </w:r>
     </w:p>
-    <w:p/>
+    <w:p>
+      <w:pPr>
+        <w:jc w:val="both"/>
+      </w:pPr>
+    </w:p>
     <w:p>
       <w:pPr>
         <w:pStyle w:val="Ttulo1"/>
-        <w:numPr>
-          <w:ilvl w:val="1"/>
-          <w:numId w:val="18"/>
-        </w:numPr>
       </w:pPr>
       <w:bookmarkStart w:id="14" w:name="_Toc238480105"/>
       <w:r>
@@ -6494,10 +6548,6 @@
     <w:p>
       <w:pPr>
         <w:pStyle w:val="Ttulo1"/>
-        <w:numPr>
-          <w:ilvl w:val="1"/>
-          <w:numId w:val="18"/>
-        </w:numPr>
       </w:pPr>
       <w:bookmarkStart w:id="15" w:name="_Toc238480106"/>
       <w:r>
@@ -6516,6 +6566,7 @@
         </w:pBdr>
         <w:spacing w:before="280" w:after="120"/>
         <w:ind w:left="120" w:right="120"/>
+        <w:jc w:val="both"/>
         <w:rPr>
           <w:rFonts w:ascii="Arial" w:eastAsia="Arial" w:hAnsi="Arial" w:cs="Arial"/>
           <w:color w:val="000000"/>
@@ -6569,6 +6620,7 @@
         </w:pBdr>
         <w:spacing w:before="280" w:after="120"/>
         <w:ind w:left="120" w:right="120"/>
+        <w:jc w:val="both"/>
         <w:rPr>
           <w:rFonts w:ascii="Arial" w:eastAsia="Arial" w:hAnsi="Arial" w:cs="Arial"/>
           <w:color w:val="000000"/>
@@ -6593,6 +6645,7 @@
         </w:pBdr>
         <w:spacing w:before="280" w:after="120"/>
         <w:ind w:left="120" w:right="120"/>
+        <w:jc w:val="both"/>
         <w:rPr>
           <w:rFonts w:ascii="Arial" w:eastAsia="Arial" w:hAnsi="Arial" w:cs="Arial"/>
           <w:color w:val="000000"/>
@@ -6646,6 +6699,7 @@
         </w:pBdr>
         <w:spacing w:before="280" w:after="120"/>
         <w:ind w:left="120" w:right="120"/>
+        <w:jc w:val="both"/>
         <w:rPr>
           <w:rFonts w:ascii="Arial" w:eastAsia="Arial" w:hAnsi="Arial" w:cs="Arial"/>
           <w:b/>
@@ -6681,6 +6735,7 @@
         </w:pBdr>
         <w:spacing w:before="280" w:after="120"/>
         <w:ind w:left="120" w:right="120"/>
+        <w:jc w:val="both"/>
         <w:rPr>
           <w:rFonts w:ascii="Arial" w:eastAsia="Arial" w:hAnsi="Arial" w:cs="Arial"/>
           <w:color w:val="000000"/>
@@ -6734,6 +6789,7 @@
         </w:pBdr>
         <w:spacing w:before="280" w:after="120"/>
         <w:ind w:left="120" w:right="120"/>
+        <w:jc w:val="both"/>
         <w:rPr>
           <w:rFonts w:ascii="Arial" w:eastAsia="Arial" w:hAnsi="Arial" w:cs="Arial"/>
           <w:b/>
@@ -6769,6 +6825,7 @@
         </w:pBdr>
         <w:spacing w:before="280" w:after="120"/>
         <w:ind w:left="120" w:right="120"/>
+        <w:jc w:val="both"/>
         <w:rPr>
           <w:rFonts w:ascii="Arial" w:eastAsia="Arial" w:hAnsi="Arial" w:cs="Arial"/>
           <w:color w:val="000000"/>
@@ -6814,6 +6871,7 @@
     <w:p>
       <w:pPr>
         <w:ind w:left="142"/>
+        <w:jc w:val="both"/>
         <w:rPr>
           <w:rFonts w:ascii="Arial" w:eastAsia="Arial" w:hAnsi="Arial" w:cs="Arial"/>
           <w:color w:val="000000"/>
@@ -6824,21 +6882,21 @@
           <w:rFonts w:ascii="Arial" w:eastAsia="Arial" w:hAnsi="Arial" w:cs="Arial"/>
           <w:color w:val="000000"/>
         </w:rPr>
-        <w:t xml:space="preserve">O sistema deve permitir a emissão de pedidos vinculando um cliente a múltiplos produtos, </w:t>
+        <w:t xml:space="preserve">O sistema deve permitir a emissão de pedidos vinculando um cliente a múltiplos </w:t>
       </w:r>
       <w:r>
         <w:rPr>
           <w:rFonts w:ascii="Arial" w:eastAsia="Arial" w:hAnsi="Arial" w:cs="Arial"/>
           <w:color w:val="000000"/>
         </w:rPr>
-        <w:t xml:space="preserve"> </w:t>
+        <w:t>produtos, calculando</w:t>
       </w:r>
       <w:r>
         <w:rPr>
           <w:rFonts w:ascii="Arial" w:eastAsia="Arial" w:hAnsi="Arial" w:cs="Arial"/>
           <w:color w:val="000000"/>
         </w:rPr>
-        <w:t xml:space="preserve">calculando os subtotais e o valor total dinamicamente. </w:t>
+        <w:t xml:space="preserve"> os subtotais e o valor total dinamicamente. </w:t>
       </w:r>
       <w:r>
         <w:rPr>
@@ -6868,6 +6926,7 @@
         </w:pBdr>
         <w:spacing w:before="280" w:after="120"/>
         <w:ind w:left="142" w:right="120"/>
+        <w:jc w:val="both"/>
         <w:rPr>
           <w:rFonts w:ascii="Arial" w:eastAsia="Arial" w:hAnsi="Arial" w:cs="Arial"/>
           <w:color w:val="000000"/>
@@ -6922,6 +6981,7 @@
     <w:p>
       <w:pPr>
         <w:ind w:left="142"/>
+        <w:jc w:val="both"/>
         <w:rPr>
           <w:rFonts w:ascii="Arial" w:eastAsia="Arial" w:hAnsi="Arial" w:cs="Arial"/>
           <w:color w:val="000000"/>
@@ -6946,6 +7006,7 @@
         </w:pBdr>
         <w:spacing w:before="280" w:after="120"/>
         <w:ind w:left="120" w:right="120"/>
+        <w:jc w:val="both"/>
         <w:rPr>
           <w:rFonts w:ascii="Arial" w:eastAsia="Arial" w:hAnsi="Arial" w:cs="Arial"/>
           <w:color w:val="000000"/>
@@ -6991,6 +7052,7 @@
     <w:p>
       <w:pPr>
         <w:ind w:left="142"/>
+        <w:jc w:val="both"/>
         <w:rPr>
           <w:rFonts w:ascii="Arial" w:eastAsia="Arial" w:hAnsi="Arial" w:cs="Arial"/>
           <w:color w:val="000000"/>
@@ -7001,12 +7063,61 @@
           <w:rFonts w:ascii="Arial" w:eastAsia="Arial" w:hAnsi="Arial" w:cs="Arial"/>
           <w:color w:val="000000"/>
         </w:rPr>
-        <w:t>O sistema deve verificar o estoque após cada movimentação e registrar alerta na tabela AlertaEstoque caso quantidadeAtual &lt;= estoqueMinimo. (Prioridade: Importante)</w:t>
+        <w:t xml:space="preserve">O sistema deve verificar o estoque após cada movimentação e registrar alerta na tabela </w:t>
+      </w:r>
+      <w:proofErr w:type="spellStart"/>
+      <w:r>
+        <w:rPr>
+          <w:rFonts w:ascii="Arial" w:eastAsia="Arial" w:hAnsi="Arial" w:cs="Arial"/>
+          <w:color w:val="000000"/>
+        </w:rPr>
+        <w:t>AlertaEstoque</w:t>
+      </w:r>
+      <w:proofErr w:type="spellEnd"/>
+      <w:r>
+        <w:rPr>
+          <w:rFonts w:ascii="Arial" w:eastAsia="Arial" w:hAnsi="Arial" w:cs="Arial"/>
+          <w:color w:val="000000"/>
+        </w:rPr>
+        <w:t xml:space="preserve"> caso </w:t>
+      </w:r>
+      <w:proofErr w:type="spellStart"/>
+      <w:r>
+        <w:rPr>
+          <w:rFonts w:ascii="Arial" w:eastAsia="Arial" w:hAnsi="Arial" w:cs="Arial"/>
+          <w:color w:val="000000"/>
+        </w:rPr>
+        <w:t>quantidadeAtual</w:t>
+      </w:r>
+      <w:proofErr w:type="spellEnd"/>
+      <w:r>
+        <w:rPr>
+          <w:rFonts w:ascii="Arial" w:eastAsia="Arial" w:hAnsi="Arial" w:cs="Arial"/>
+          <w:color w:val="000000"/>
+        </w:rPr>
+        <w:t xml:space="preserve"> &lt;= </w:t>
+      </w:r>
+      <w:proofErr w:type="spellStart"/>
+      <w:r>
+        <w:rPr>
+          <w:rFonts w:ascii="Arial" w:eastAsia="Arial" w:hAnsi="Arial" w:cs="Arial"/>
+          <w:color w:val="000000"/>
+        </w:rPr>
+        <w:t>estoqueMinimo</w:t>
+      </w:r>
+      <w:proofErr w:type="spellEnd"/>
+      <w:r>
+        <w:rPr>
+          <w:rFonts w:ascii="Arial" w:eastAsia="Arial" w:hAnsi="Arial" w:cs="Arial"/>
+          <w:color w:val="000000"/>
+        </w:rPr>
+        <w:t>. (Prioridade: Importante)</w:t>
       </w:r>
     </w:p>
     <w:p>
       <w:pPr>
         <w:ind w:left="142"/>
+        <w:jc w:val="both"/>
         <w:rPr>
           <w:rFonts w:ascii="Arial" w:eastAsia="Arial" w:hAnsi="Arial" w:cs="Arial"/>
           <w:color w:val="000000"/>
@@ -7171,13 +7282,25 @@
         <w:rPr>
           <w:rFonts w:ascii="Arial" w:hAnsi="Arial" w:cs="Arial"/>
         </w:rPr>
-        <w:t xml:space="preserve">O sistema deve </w:t>
+        <w:t xml:space="preserve">O sistema </w:t>
       </w:r>
       <w:r>
         <w:rPr>
           <w:rFonts w:ascii="Arial" w:hAnsi="Arial" w:cs="Arial"/>
         </w:rPr>
-        <w:t xml:space="preserve">Fornecer </w:t>
+        <w:t xml:space="preserve">deve </w:t>
+      </w:r>
+      <w:r>
+        <w:rPr>
+          <w:rFonts w:ascii="Arial" w:hAnsi="Arial" w:cs="Arial"/>
+        </w:rPr>
+        <w:t>fornecer</w:t>
+      </w:r>
+      <w:r>
+        <w:rPr>
+          <w:rFonts w:ascii="Arial" w:hAnsi="Arial" w:cs="Arial"/>
+        </w:rPr>
+        <w:t xml:space="preserve"> </w:t>
       </w:r>
       <w:r>
         <w:rPr>
@@ -7223,30 +7346,28 @@
       </w:r>
       <w:bookmarkEnd w:id="16"/>
     </w:p>
+    <w:p>
+      <w:pPr>
+        <w:jc w:val="both"/>
+      </w:pPr>
+    </w:p>
+    <w:p>
+      <w:pPr>
+        <w:pStyle w:val="Ttulo1"/>
+      </w:pPr>
+      <w:bookmarkStart w:id="17" w:name="_Toc238480108"/>
+      <w:r>
+        <w:t xml:space="preserve">Casos de Uso: </w:t>
+      </w:r>
+      <w:r>
+        <w:t>Administrador</w:t>
+      </w:r>
+      <w:bookmarkEnd w:id="17"/>
+      <w:r>
+        <w:t xml:space="preserve"> </w:t>
+      </w:r>
+    </w:p>
     <w:p/>
-    <w:p>
-      <w:pPr>
-        <w:pStyle w:val="Ttulo1"/>
-        <w:numPr>
-          <w:ilvl w:val="1"/>
-          <w:numId w:val="18"/>
-        </w:numPr>
-        <w:rPr>
-          <w:color w:val="0070C0"/>
-        </w:rPr>
-      </w:pPr>
-      <w:bookmarkStart w:id="17" w:name="_Toc238480108"/>
-      <w:r>
-        <w:t xml:space="preserve">Casos de Uso: </w:t>
-      </w:r>
-      <w:r>
-        <w:t>Administrador</w:t>
-      </w:r>
-      <w:bookmarkEnd w:id="17"/>
-      <w:r>
-        <w:t xml:space="preserve"> </w:t>
-      </w:r>
-    </w:p>
     <w:p>
       <w:pPr>
         <w:jc w:val="center"/>
@@ -7325,17 +7446,35 @@
     </w:p>
     <w:p>
       <w:pPr>
+        <w:rPr>
+          <w:rFonts w:ascii="Arial" w:eastAsia="Arial" w:hAnsi="Arial" w:cs="Arial"/>
+        </w:rPr>
+      </w:pPr>
+    </w:p>
+    <w:p>
+      <w:pPr>
+        <w:rPr>
+          <w:rFonts w:ascii="Arial" w:eastAsia="Arial" w:hAnsi="Arial" w:cs="Arial"/>
+        </w:rPr>
+      </w:pPr>
+    </w:p>
+    <w:p>
+      <w:pPr>
+        <w:rPr>
+          <w:rFonts w:ascii="Arial" w:eastAsia="Arial" w:hAnsi="Arial" w:cs="Arial"/>
+        </w:rPr>
+      </w:pPr>
+    </w:p>
+    <w:p>
+      <w:pPr>
         <w:pStyle w:val="Ttulo1"/>
-        <w:numPr>
-          <w:ilvl w:val="1"/>
-          <w:numId w:val="18"/>
-        </w:numPr>
         <w:rPr>
           <w:color w:val="0070C0"/>
         </w:rPr>
       </w:pPr>
       <w:bookmarkStart w:id="18" w:name="_Toc238480109"/>
       <w:r>
+        <w:lastRenderedPageBreak/>
         <w:t>Casos de Uso: Administrador Geral</w:t>
       </w:r>
       <w:bookmarkEnd w:id="18"/>
@@ -7373,17 +7512,21 @@
     <w:p>
       <w:pPr>
         <w:pStyle w:val="Ttulo1"/>
-        <w:numPr>
-          <w:ilvl w:val="1"/>
-          <w:numId w:val="18"/>
-        </w:numPr>
+        <w:rPr>
+          <w:szCs w:val="24"/>
+        </w:rPr>
       </w:pPr>
       <w:bookmarkStart w:id="19" w:name="_Toc238480110"/>
       <w:r>
-        <w:lastRenderedPageBreak/>
+        <w:rPr>
+          <w:szCs w:val="24"/>
+        </w:rPr>
         <w:t xml:space="preserve">[RU ADM01] – Gerenciamento </w:t>
       </w:r>
       <w:r>
+        <w:rPr>
+          <w:szCs w:val="24"/>
+        </w:rPr>
         <w:t>Geral</w:t>
       </w:r>
       <w:bookmarkEnd w:id="19"/>
@@ -7392,7 +7535,7 @@
       <w:pPr>
         <w:pStyle w:val="Ttulo4"/>
         <w:spacing w:line="360" w:lineRule="auto"/>
-        <w:jc w:val="left"/>
+        <w:jc w:val="both"/>
         <w:rPr>
           <w:sz w:val="24"/>
           <w:szCs w:val="24"/>
@@ -7410,7 +7553,7 @@
       <w:pPr>
         <w:pStyle w:val="Ttulo4"/>
         <w:spacing w:line="360" w:lineRule="auto"/>
-        <w:jc w:val="left"/>
+        <w:jc w:val="both"/>
         <w:rPr>
           <w:sz w:val="24"/>
           <w:szCs w:val="24"/>
@@ -7427,6 +7570,7 @@
     <w:p>
       <w:pPr>
         <w:spacing w:line="360" w:lineRule="auto"/>
+        <w:jc w:val="both"/>
         <w:rPr>
           <w:rFonts w:ascii="Arial" w:eastAsia="Arial" w:hAnsi="Arial" w:cs="Arial"/>
         </w:rPr>
@@ -7441,6 +7585,7 @@
     <w:p>
       <w:pPr>
         <w:spacing w:line="360" w:lineRule="auto"/>
+        <w:jc w:val="both"/>
         <w:rPr>
           <w:rFonts w:ascii="Arial" w:eastAsia="Arial" w:hAnsi="Arial" w:cs="Arial"/>
         </w:rPr>
@@ -7449,6 +7594,7 @@
     <w:p>
       <w:pPr>
         <w:spacing w:line="360" w:lineRule="auto"/>
+        <w:jc w:val="both"/>
         <w:rPr>
           <w:rFonts w:ascii="Arial" w:eastAsia="Arial" w:hAnsi="Arial" w:cs="Arial"/>
           <w:b/>
@@ -7467,6 +7613,7 @@
     <w:p>
       <w:pPr>
         <w:spacing w:line="360" w:lineRule="auto"/>
+        <w:jc w:val="both"/>
         <w:rPr>
           <w:rFonts w:ascii="Arial" w:eastAsia="Arial" w:hAnsi="Arial" w:cs="Arial"/>
         </w:rPr>
@@ -7482,7 +7629,7 @@
       <w:pPr>
         <w:pStyle w:val="Ttulo4"/>
         <w:spacing w:line="360" w:lineRule="auto"/>
-        <w:jc w:val="left"/>
+        <w:jc w:val="both"/>
         <w:rPr>
           <w:sz w:val="24"/>
           <w:szCs w:val="24"/>
@@ -7504,6 +7651,7 @@
           <w:numId w:val="12"/>
         </w:numPr>
         <w:spacing w:line="360" w:lineRule="auto"/>
+        <w:jc w:val="both"/>
         <w:rPr>
           <w:rFonts w:ascii="Arial" w:eastAsia="Arial" w:hAnsi="Arial" w:cs="Arial"/>
         </w:rPr>
@@ -7523,6 +7671,7 @@
           <w:numId w:val="12"/>
         </w:numPr>
         <w:spacing w:line="360" w:lineRule="auto"/>
+        <w:jc w:val="both"/>
         <w:rPr>
           <w:rFonts w:ascii="Arial" w:eastAsia="Arial" w:hAnsi="Arial" w:cs="Arial"/>
         </w:rPr>
@@ -7542,6 +7691,7 @@
           <w:numId w:val="12"/>
         </w:numPr>
         <w:spacing w:line="360" w:lineRule="auto"/>
+        <w:jc w:val="both"/>
         <w:rPr>
           <w:rFonts w:ascii="Arial" w:eastAsia="Arial" w:hAnsi="Arial" w:cs="Arial"/>
         </w:rPr>
@@ -7561,6 +7711,7 @@
           <w:numId w:val="12"/>
         </w:numPr>
         <w:spacing w:line="360" w:lineRule="auto"/>
+        <w:jc w:val="both"/>
         <w:rPr>
           <w:rFonts w:ascii="Arial" w:eastAsia="Arial" w:hAnsi="Arial" w:cs="Arial"/>
         </w:rPr>
@@ -7576,6 +7727,7 @@
       <w:pPr>
         <w:spacing w:line="360" w:lineRule="auto"/>
         <w:ind w:left="1080"/>
+        <w:jc w:val="both"/>
         <w:rPr>
           <w:rFonts w:ascii="Arial" w:eastAsia="Arial" w:hAnsi="Arial" w:cs="Arial"/>
           <w:color w:val="0070C0"/>
@@ -7586,7 +7738,7 @@
       <w:pPr>
         <w:pStyle w:val="Ttulo4"/>
         <w:spacing w:line="360" w:lineRule="auto"/>
-        <w:jc w:val="left"/>
+        <w:jc w:val="both"/>
         <w:rPr>
           <w:sz w:val="24"/>
           <w:szCs w:val="24"/>
@@ -7608,6 +7760,7 @@
           <w:numId w:val="11"/>
         </w:numPr>
         <w:spacing w:line="360" w:lineRule="auto"/>
+        <w:jc w:val="both"/>
         <w:rPr>
           <w:rFonts w:ascii="Arial" w:eastAsia="Arial" w:hAnsi="Arial" w:cs="Arial"/>
         </w:rPr>
@@ -7627,6 +7780,7 @@
           <w:numId w:val="11"/>
         </w:numPr>
         <w:spacing w:line="360" w:lineRule="auto"/>
+        <w:jc w:val="both"/>
         <w:rPr>
           <w:rFonts w:ascii="Arial" w:eastAsia="Arial" w:hAnsi="Arial" w:cs="Arial"/>
         </w:rPr>
@@ -7646,6 +7800,7 @@
           <w:numId w:val="11"/>
         </w:numPr>
         <w:spacing w:line="360" w:lineRule="auto"/>
+        <w:jc w:val="both"/>
         <w:rPr>
           <w:rFonts w:ascii="Arial" w:eastAsia="Arial" w:hAnsi="Arial" w:cs="Arial"/>
         </w:rPr>
@@ -7665,6 +7820,7 @@
           <w:numId w:val="11"/>
         </w:numPr>
         <w:spacing w:line="360" w:lineRule="auto"/>
+        <w:jc w:val="both"/>
         <w:rPr>
           <w:rFonts w:ascii="Arial" w:eastAsia="Arial" w:hAnsi="Arial" w:cs="Arial"/>
         </w:rPr>
@@ -7678,6 +7834,7 @@
     </w:p>
     <w:p>
       <w:pPr>
+        <w:jc w:val="both"/>
         <w:rPr>
           <w:rFonts w:ascii="Arial" w:eastAsia="Arial" w:hAnsi="Arial" w:cs="Arial"/>
         </w:rPr>
@@ -7687,7 +7844,7 @@
       <w:pPr>
         <w:pStyle w:val="Ttulo4"/>
         <w:spacing w:line="360" w:lineRule="auto"/>
-        <w:jc w:val="left"/>
+        <w:jc w:val="both"/>
         <w:rPr>
           <w:sz w:val="24"/>
           <w:szCs w:val="24"/>
@@ -7708,6 +7865,7 @@
           <w:ilvl w:val="0"/>
           <w:numId w:val="10"/>
         </w:numPr>
+        <w:jc w:val="both"/>
         <w:rPr>
           <w:rFonts w:ascii="Arial" w:hAnsi="Arial" w:cs="Arial"/>
         </w:rPr>
@@ -7726,6 +7884,7 @@
           <w:ilvl w:val="0"/>
           <w:numId w:val="10"/>
         </w:numPr>
+        <w:jc w:val="both"/>
         <w:rPr>
           <w:rFonts w:ascii="Arial" w:hAnsi="Arial" w:cs="Arial"/>
         </w:rPr>
@@ -7744,6 +7903,7 @@
           <w:ilvl w:val="0"/>
           <w:numId w:val="10"/>
         </w:numPr>
+        <w:jc w:val="both"/>
         <w:rPr>
           <w:rFonts w:ascii="Arial" w:hAnsi="Arial" w:cs="Arial"/>
         </w:rPr>
@@ -7762,6 +7922,7 @@
           <w:ilvl w:val="0"/>
           <w:numId w:val="10"/>
         </w:numPr>
+        <w:jc w:val="both"/>
         <w:rPr>
           <w:rFonts w:ascii="Arial" w:hAnsi="Arial" w:cs="Arial"/>
         </w:rPr>
@@ -7780,6 +7941,7 @@
           <w:ilvl w:val="0"/>
           <w:numId w:val="10"/>
         </w:numPr>
+        <w:jc w:val="both"/>
         <w:rPr>
           <w:rFonts w:ascii="Arial" w:hAnsi="Arial" w:cs="Arial"/>
         </w:rPr>
@@ -7790,23 +7952,30 @@
         </w:rPr>
         <w:t>O sistema persiste a alteração e atualiza a listagem com mensagem de sucesso.</w:t>
       </w:r>
-    </w:p>
-    <w:p>
-      <w:pPr>
-        <w:jc w:val="both"/>
-        <w:rPr>
-          <w:rFonts w:ascii="Arial" w:eastAsia="Arial" w:hAnsi="Arial" w:cs="Arial"/>
-        </w:rPr>
-      </w:pPr>
       <w:bookmarkStart w:id="20" w:name="_heading=h.p5heg2hzipqt" w:colFirst="0" w:colLast="0"/>
       <w:bookmarkEnd w:id="20"/>
     </w:p>
     <w:p>
       <w:pPr>
+        <w:jc w:val="both"/>
+        <w:rPr>
+          <w:rFonts w:ascii="Arial" w:hAnsi="Arial" w:cs="Arial"/>
+        </w:rPr>
+      </w:pPr>
+    </w:p>
+    <w:p>
+      <w:pPr>
         <w:pStyle w:val="Ttulo1"/>
+        <w:rPr>
+          <w:szCs w:val="24"/>
+        </w:rPr>
       </w:pPr>
       <w:bookmarkStart w:id="21" w:name="_Toc238480111"/>
       <w:r>
+        <w:rPr>
+          <w:szCs w:val="24"/>
+        </w:rPr>
+        <w:lastRenderedPageBreak/>
         <w:t>Requisitos não funcionais</w:t>
       </w:r>
       <w:bookmarkEnd w:id="21"/>
@@ -7815,7 +7984,7 @@
       <w:pPr>
         <w:pStyle w:val="Ttulo4"/>
         <w:spacing w:line="360" w:lineRule="auto"/>
-        <w:jc w:val="left"/>
+        <w:jc w:val="both"/>
         <w:rPr>
           <w:b w:val="0"/>
           <w:bCs w:val="0"/>
@@ -7832,37 +8001,39 @@
           <w:sz w:val="24"/>
           <w:szCs w:val="24"/>
         </w:rPr>
-        <w:t xml:space="preserve">Os requisitos não funcionais definem características e restrições relacionadas ao funcionamento, desempenho, arquitetura e qualidade do Sistema de Controle de </w:t>
-      </w:r>
-      <w:r>
-        <w:rPr>
-          <w:b w:val="0"/>
-          <w:bCs w:val="0"/>
-          <w:sz w:val="24"/>
+        <w:t xml:space="preserve">Os requisitos não funcionais definem características e restrições relacionadas ao funcionamento, desempenho, arquitetura e qualidade do Sistema de Controle de Clientes e Pedidos (SCCP). Esses requisitos complementam os requisitos funcionais e estabelecem condições que devem ser atendidas pelo sistema. </w:t>
+      </w:r>
+    </w:p>
+    <w:p>
+      <w:pPr>
+        <w:pStyle w:val="Ttulo1"/>
+        <w:rPr>
           <w:szCs w:val="24"/>
         </w:rPr>
-        <w:lastRenderedPageBreak/>
-        <w:t xml:space="preserve">Clientes e Pedidos (SCCP). Esses requisitos complementam os requisitos funcionais e estabelecem condições que devem ser atendidas pelo sistema. </w:t>
-      </w:r>
-    </w:p>
-    <w:p>
-      <w:pPr>
-        <w:pStyle w:val="Ttulo1"/>
-        <w:numPr>
-          <w:ilvl w:val="1"/>
-          <w:numId w:val="18"/>
-        </w:numPr>
       </w:pPr>
       <w:bookmarkStart w:id="23" w:name="_Toc238480112"/>
       <w:r>
+        <w:rPr>
+          <w:szCs w:val="24"/>
+        </w:rPr>
         <w:t xml:space="preserve">[RNF 01] – </w:t>
       </w:r>
       <w:bookmarkEnd w:id="23"/>
       <w:r>
+        <w:rPr>
+          <w:szCs w:val="24"/>
+        </w:rPr>
         <w:t>Arquitetura em Camadas (MVC):</w:t>
       </w:r>
     </w:p>
-    <w:p/>
+    <w:p>
+      <w:pPr>
+        <w:jc w:val="both"/>
+        <w:rPr>
+          <w:rFonts w:ascii="Arial" w:hAnsi="Arial" w:cs="Arial"/>
+        </w:rPr>
+      </w:pPr>
+    </w:p>
     <w:p>
       <w:pPr>
         <w:pBdr>
@@ -7874,6 +8045,7 @@
         </w:pBdr>
         <w:spacing w:line="360" w:lineRule="auto"/>
         <w:ind w:left="600"/>
+        <w:jc w:val="both"/>
         <w:rPr>
           <w:rFonts w:ascii="Arial" w:eastAsia="Arial" w:hAnsi="Arial" w:cs="Arial"/>
           <w:color w:val="000000"/>
@@ -7899,19 +8071,76 @@
         <w:rPr>
           <w:rFonts w:ascii="Arial" w:eastAsia="Arial" w:hAnsi="Arial" w:cs="Arial"/>
         </w:rPr>
-        <w:t xml:space="preserve">O sistema deverá utilizar uma arquitetura baseada no padrão MVC (Model-View-Controller), </w:t>
-      </w:r>
-      <w:r>
-        <w:rPr>
-          <w:rFonts w:ascii="Arial" w:eastAsia="Arial" w:hAnsi="Arial" w:cs="Arial"/>
-        </w:rPr>
-        <w:t xml:space="preserve">com clara separação entre Controllers, Services, Repositories e Models no Spring Boot </w:t>
+        <w:t>O sistema deverá utilizar uma arquitetura baseada no padrão MVC (Model-</w:t>
+      </w:r>
+      <w:proofErr w:type="spellStart"/>
+      <w:r>
+        <w:rPr>
+          <w:rFonts w:ascii="Arial" w:eastAsia="Arial" w:hAnsi="Arial" w:cs="Arial"/>
+        </w:rPr>
+        <w:t>View</w:t>
+      </w:r>
+      <w:proofErr w:type="spellEnd"/>
+      <w:r>
+        <w:rPr>
+          <w:rFonts w:ascii="Arial" w:eastAsia="Arial" w:hAnsi="Arial" w:cs="Arial"/>
+        </w:rPr>
+        <w:t>-</w:t>
+      </w:r>
+      <w:proofErr w:type="spellStart"/>
+      <w:r>
+        <w:rPr>
+          <w:rFonts w:ascii="Arial" w:eastAsia="Arial" w:hAnsi="Arial" w:cs="Arial"/>
+        </w:rPr>
+        <w:t>Controller</w:t>
+      </w:r>
+      <w:proofErr w:type="spellEnd"/>
+      <w:r>
+        <w:rPr>
+          <w:rFonts w:ascii="Arial" w:eastAsia="Arial" w:hAnsi="Arial" w:cs="Arial"/>
+        </w:rPr>
+        <w:t xml:space="preserve">), </w:t>
+      </w:r>
+      <w:r>
+        <w:rPr>
+          <w:rFonts w:ascii="Arial" w:eastAsia="Arial" w:hAnsi="Arial" w:cs="Arial"/>
+        </w:rPr>
+        <w:t xml:space="preserve">com clara separação entre </w:t>
+      </w:r>
+      <w:proofErr w:type="spellStart"/>
+      <w:r>
+        <w:rPr>
+          <w:rFonts w:ascii="Arial" w:eastAsia="Arial" w:hAnsi="Arial" w:cs="Arial"/>
+        </w:rPr>
+        <w:t>Controllers</w:t>
+      </w:r>
+      <w:proofErr w:type="spellEnd"/>
+      <w:r>
+        <w:rPr>
+          <w:rFonts w:ascii="Arial" w:eastAsia="Arial" w:hAnsi="Arial" w:cs="Arial"/>
+        </w:rPr>
+        <w:t xml:space="preserve">, Services, </w:t>
+      </w:r>
+      <w:proofErr w:type="spellStart"/>
+      <w:r>
+        <w:rPr>
+          <w:rFonts w:ascii="Arial" w:eastAsia="Arial" w:hAnsi="Arial" w:cs="Arial"/>
+        </w:rPr>
+        <w:t>Repositories</w:t>
+      </w:r>
+      <w:proofErr w:type="spellEnd"/>
+      <w:r>
+        <w:rPr>
+          <w:rFonts w:ascii="Arial" w:eastAsia="Arial" w:hAnsi="Arial" w:cs="Arial"/>
+        </w:rPr>
+        <w:t xml:space="preserve"> e Models no Spring Boot </w:t>
       </w:r>
     </w:p>
     <w:p>
       <w:pPr>
         <w:spacing w:line="360" w:lineRule="auto"/>
         <w:ind w:left="600"/>
+        <w:jc w:val="both"/>
         <w:rPr>
           <w:rFonts w:ascii="Arial" w:eastAsia="Arial" w:hAnsi="Arial" w:cs="Arial"/>
         </w:rPr>
@@ -7947,6 +8176,7 @@
     </w:p>
     <w:p>
       <w:pPr>
+        <w:jc w:val="both"/>
         <w:rPr>
           <w:rFonts w:ascii="Arial" w:hAnsi="Arial" w:cs="Arial"/>
         </w:rPr>
@@ -7955,22 +8185,28 @@
     <w:p>
       <w:pPr>
         <w:pStyle w:val="Ttulo1"/>
-        <w:numPr>
-          <w:ilvl w:val="1"/>
-          <w:numId w:val="18"/>
-        </w:numPr>
+        <w:rPr>
+          <w:szCs w:val="24"/>
+        </w:rPr>
       </w:pPr>
       <w:bookmarkStart w:id="24" w:name="_Toc238480113"/>
       <w:r>
+        <w:rPr>
+          <w:szCs w:val="24"/>
+        </w:rPr>
         <w:t>[RNF 02] – Desempenho</w:t>
       </w:r>
       <w:bookmarkEnd w:id="24"/>
       <w:r>
+        <w:rPr>
+          <w:szCs w:val="24"/>
+        </w:rPr>
         <w:t xml:space="preserve"> </w:t>
       </w:r>
     </w:p>
     <w:p>
       <w:pPr>
+        <w:jc w:val="both"/>
         <w:rPr>
           <w:rFonts w:ascii="Arial" w:hAnsi="Arial" w:cs="Arial"/>
         </w:rPr>
@@ -8005,11 +8241,26 @@
         <w:rPr>
           <w:rFonts w:ascii="Arial" w:eastAsia="Arial" w:hAnsi="Arial" w:cs="Arial"/>
         </w:rPr>
-        <w:t>O tempo de resposta para opereções normais de consulta e gravação deve ser inferior a 2 segundos em ambiente de rede local.</w:t>
-      </w:r>
-    </w:p>
-    <w:p>
-      <w:pPr>
+        <w:t xml:space="preserve">O tempo de resposta para </w:t>
+      </w:r>
+      <w:proofErr w:type="spellStart"/>
+      <w:r>
+        <w:rPr>
+          <w:rFonts w:ascii="Arial" w:eastAsia="Arial" w:hAnsi="Arial" w:cs="Arial"/>
+        </w:rPr>
+        <w:t>opereções</w:t>
+      </w:r>
+      <w:proofErr w:type="spellEnd"/>
+      <w:r>
+        <w:rPr>
+          <w:rFonts w:ascii="Arial" w:eastAsia="Arial" w:hAnsi="Arial" w:cs="Arial"/>
+        </w:rPr>
+        <w:t xml:space="preserve"> normais de consulta e gravação deve ser inferior a 2 segundos em ambiente de rede local.</w:t>
+      </w:r>
+    </w:p>
+    <w:p>
+      <w:pPr>
+        <w:jc w:val="both"/>
         <w:rPr>
           <w:rFonts w:ascii="Arial" w:hAnsi="Arial" w:cs="Arial"/>
         </w:rPr>
@@ -8025,6 +8276,7 @@
           <w:between w:val="nil"/>
         </w:pBdr>
         <w:ind w:left="601"/>
+        <w:jc w:val="both"/>
         <w:rPr>
           <w:rFonts w:ascii="Arial" w:eastAsia="Arial" w:hAnsi="Arial" w:cs="Arial"/>
           <w:color w:val="000000"/>
@@ -8063,6 +8315,7 @@
           <w:right w:val="nil"/>
           <w:between w:val="nil"/>
         </w:pBdr>
+        <w:jc w:val="both"/>
         <w:rPr>
           <w:rFonts w:ascii="Arial" w:hAnsi="Arial" w:cs="Arial"/>
           <w:color w:val="000000"/>
@@ -8072,28 +8325,40 @@
     <w:p>
       <w:pPr>
         <w:pStyle w:val="Ttulo1"/>
-        <w:numPr>
-          <w:ilvl w:val="1"/>
-          <w:numId w:val="18"/>
-        </w:numPr>
+        <w:rPr>
+          <w:szCs w:val="24"/>
+        </w:rPr>
       </w:pPr>
       <w:bookmarkStart w:id="25" w:name="_Toc238480114"/>
       <w:r>
+        <w:rPr>
+          <w:szCs w:val="24"/>
+        </w:rPr>
         <w:t>[RNF 0</w:t>
       </w:r>
       <w:r>
+        <w:rPr>
+          <w:szCs w:val="24"/>
+        </w:rPr>
         <w:t>3</w:t>
       </w:r>
       <w:r>
+        <w:rPr>
+          <w:szCs w:val="24"/>
+        </w:rPr>
         <w:t xml:space="preserve">] – </w:t>
       </w:r>
       <w:bookmarkEnd w:id="25"/>
       <w:r>
+        <w:rPr>
+          <w:szCs w:val="24"/>
+        </w:rPr>
         <w:t>Persistência Relacional</w:t>
       </w:r>
     </w:p>
     <w:p>
       <w:pPr>
+        <w:jc w:val="both"/>
         <w:rPr>
           <w:rFonts w:ascii="Arial" w:hAnsi="Arial" w:cs="Arial"/>
         </w:rPr>
@@ -8109,6 +8374,7 @@
           <w:between w:val="nil"/>
         </w:pBdr>
         <w:ind w:left="601"/>
+        <w:jc w:val="both"/>
         <w:rPr>
           <w:rFonts w:ascii="Arial" w:eastAsia="Arial" w:hAnsi="Arial" w:cs="Arial"/>
           <w:color w:val="000000"/>
@@ -8134,7 +8400,21 @@
         <w:rPr>
           <w:rFonts w:ascii="Arial" w:eastAsia="Arial" w:hAnsi="Arial" w:cs="Arial"/>
         </w:rPr>
-        <w:t>O sistema deve utilizar o SGBD MySQL 8.0 gerenciado via Spring Data JPA e Hibernate.</w:t>
+        <w:t xml:space="preserve">O sistema deve utilizar o SGBD MySQL 8.0 gerenciado via Spring Data JPA e </w:t>
+      </w:r>
+      <w:proofErr w:type="spellStart"/>
+      <w:r>
+        <w:rPr>
+          <w:rFonts w:ascii="Arial" w:eastAsia="Arial" w:hAnsi="Arial" w:cs="Arial"/>
+        </w:rPr>
+        <w:t>Hibernate</w:t>
+      </w:r>
+      <w:proofErr w:type="spellEnd"/>
+      <w:r>
+        <w:rPr>
+          <w:rFonts w:ascii="Arial" w:eastAsia="Arial" w:hAnsi="Arial" w:cs="Arial"/>
+        </w:rPr>
+        <w:t>.</w:t>
       </w:r>
     </w:p>
     <w:p>
@@ -8147,6 +8427,7 @@
           <w:between w:val="nil"/>
         </w:pBdr>
         <w:ind w:left="601"/>
+        <w:jc w:val="both"/>
         <w:rPr>
           <w:rFonts w:ascii="Arial" w:eastAsia="Arial" w:hAnsi="Arial" w:cs="Arial"/>
           <w:color w:val="000000"/>
@@ -8163,6 +8444,7 @@
           <w:between w:val="nil"/>
         </w:pBdr>
         <w:ind w:left="601"/>
+        <w:jc w:val="both"/>
         <w:rPr>
           <w:rFonts w:ascii="Arial" w:eastAsia="Arial" w:hAnsi="Arial" w:cs="Arial"/>
           <w:color w:val="000000"/>
@@ -8201,6 +8483,7 @@
           <w:right w:val="nil"/>
           <w:between w:val="nil"/>
         </w:pBdr>
+        <w:jc w:val="both"/>
         <w:rPr>
           <w:rFonts w:ascii="Arial" w:hAnsi="Arial" w:cs="Arial"/>
           <w:color w:val="000000"/>
@@ -8210,31 +8493,46 @@
     <w:p>
       <w:pPr>
         <w:pStyle w:val="Ttulo1"/>
-        <w:numPr>
-          <w:ilvl w:val="1"/>
-          <w:numId w:val="18"/>
-        </w:numPr>
-      </w:pPr>
-      <w:r>
+        <w:rPr>
+          <w:szCs w:val="24"/>
+        </w:rPr>
+      </w:pPr>
+      <w:r>
+        <w:rPr>
+          <w:szCs w:val="24"/>
+        </w:rPr>
         <w:t xml:space="preserve"> </w:t>
       </w:r>
       <w:bookmarkStart w:id="26" w:name="_Toc238480115"/>
       <w:r>
+        <w:rPr>
+          <w:szCs w:val="24"/>
+        </w:rPr>
         <w:t xml:space="preserve">[RNF </w:t>
       </w:r>
       <w:r>
+        <w:rPr>
+          <w:szCs w:val="24"/>
+        </w:rPr>
         <w:t>4</w:t>
       </w:r>
       <w:r>
+        <w:rPr>
+          <w:szCs w:val="24"/>
+        </w:rPr>
         <w:t xml:space="preserve">] – </w:t>
       </w:r>
       <w:bookmarkEnd w:id="26"/>
       <w:r>
+        <w:rPr>
+          <w:szCs w:val="24"/>
+        </w:rPr>
         <w:t>Integridade transacional (ACID)</w:t>
       </w:r>
     </w:p>
     <w:p>
       <w:pPr>
+        <w:jc w:val="both"/>
         <w:rPr>
           <w:rFonts w:ascii="Arial" w:hAnsi="Arial" w:cs="Arial"/>
         </w:rPr>
@@ -8250,6 +8548,7 @@
           <w:between w:val="nil"/>
         </w:pBdr>
         <w:ind w:left="601"/>
+        <w:jc w:val="both"/>
         <w:rPr>
           <w:rFonts w:ascii="Arial" w:eastAsia="Arial" w:hAnsi="Arial" w:cs="Arial"/>
           <w:color w:val="000000"/>
@@ -8292,6 +8591,7 @@
           <w:between w:val="nil"/>
         </w:pBdr>
         <w:ind w:left="601"/>
+        <w:jc w:val="both"/>
         <w:rPr>
           <w:rFonts w:ascii="Arial" w:eastAsia="Arial" w:hAnsi="Arial" w:cs="Arial"/>
           <w:color w:val="000000"/>
@@ -8308,6 +8608,7 @@
           <w:between w:val="nil"/>
         </w:pBdr>
         <w:ind w:left="601"/>
+        <w:jc w:val="both"/>
         <w:rPr>
           <w:rFonts w:ascii="Arial" w:eastAsia="Arial" w:hAnsi="Arial" w:cs="Arial"/>
         </w:rPr>
@@ -8351,6 +8652,7 @@
           <w:between w:val="nil"/>
         </w:pBdr>
         <w:ind w:left="601"/>
+        <w:jc w:val="both"/>
         <w:rPr>
           <w:rFonts w:ascii="Arial" w:eastAsia="Arial" w:hAnsi="Arial" w:cs="Arial"/>
         </w:rPr>
@@ -8370,6 +8672,7 @@
           <w:right w:val="nil"/>
           <w:between w:val="nil"/>
         </w:pBdr>
+        <w:jc w:val="both"/>
         <w:rPr>
           <w:rFonts w:ascii="Arial" w:eastAsia="Arial" w:hAnsi="Arial" w:cs="Arial"/>
           <w:b/>
@@ -8411,6 +8714,7 @@
           <w:right w:val="nil"/>
           <w:between w:val="nil"/>
         </w:pBdr>
+        <w:jc w:val="both"/>
         <w:rPr>
           <w:rFonts w:ascii="Arial" w:eastAsia="Arial" w:hAnsi="Arial" w:cs="Arial"/>
         </w:rPr>
@@ -8422,22 +8726,27 @@
           <w:bCs/>
           <w:color w:val="000000"/>
         </w:rPr>
-        <w:t>Descrição:</w:t>
-      </w:r>
-      <w:r>
-        <w:rPr>
-          <w:rFonts w:ascii="Arial" w:eastAsia="Arial" w:hAnsi="Arial" w:cs="Arial"/>
-          <w:b/>
-          <w:bCs/>
-          <w:color w:val="000000"/>
-        </w:rPr>
-        <w:t xml:space="preserve">  </w:t>
-      </w:r>
-      <w:r>
-        <w:rPr>
-          <w:rFonts w:ascii="Arial" w:eastAsia="Arial" w:hAnsi="Arial" w:cs="Arial"/>
-        </w:rPr>
-        <w:t>A entidade Estoque deve conter controle de concorrência com @Version para evitar sobrescritas concorrentes de saldo (lost updates).</w:t>
+        <w:t xml:space="preserve">Descrição:  </w:t>
+      </w:r>
+      <w:r>
+        <w:rPr>
+          <w:rFonts w:ascii="Arial" w:eastAsia="Arial" w:hAnsi="Arial" w:cs="Arial"/>
+        </w:rPr>
+        <w:t>A entidade Estoque deve conter controle de concorrência com @Version para evitar sobrescritas concorrentes de saldo (</w:t>
+      </w:r>
+      <w:proofErr w:type="spellStart"/>
+      <w:r>
+        <w:rPr>
+          <w:rFonts w:ascii="Arial" w:eastAsia="Arial" w:hAnsi="Arial" w:cs="Arial"/>
+        </w:rPr>
+        <w:t>lost</w:t>
+      </w:r>
+      <w:proofErr w:type="spellEnd"/>
+      <w:r>
+        <w:rPr>
+          <w:rFonts w:ascii="Arial" w:eastAsia="Arial" w:hAnsi="Arial" w:cs="Arial"/>
+        </w:rPr>
+        <w:t xml:space="preserve"> updates).</w:t>
       </w:r>
     </w:p>
     <w:p>
@@ -8450,6 +8759,7 @@
           <w:right w:val="nil"/>
           <w:between w:val="nil"/>
         </w:pBdr>
+        <w:jc w:val="both"/>
         <w:rPr>
           <w:rFonts w:ascii="Arial" w:eastAsia="Arial" w:hAnsi="Arial" w:cs="Arial"/>
         </w:rPr>
@@ -8465,6 +8775,7 @@
           <w:right w:val="nil"/>
           <w:between w:val="nil"/>
         </w:pBdr>
+        <w:jc w:val="both"/>
         <w:rPr>
           <w:rFonts w:ascii="Arial" w:eastAsia="Arial" w:hAnsi="Arial" w:cs="Arial"/>
         </w:rPr>
@@ -8493,6 +8804,7 @@
           <w:right w:val="nil"/>
           <w:between w:val="nil"/>
         </w:pBdr>
+        <w:jc w:val="both"/>
         <w:rPr>
           <w:rFonts w:ascii="Arial" w:eastAsia="Arial" w:hAnsi="Arial" w:cs="Arial"/>
         </w:rPr>
@@ -8512,6 +8824,7 @@
           <w:right w:val="nil"/>
           <w:between w:val="nil"/>
         </w:pBdr>
+        <w:jc w:val="both"/>
         <w:rPr>
           <w:rFonts w:ascii="Arial" w:eastAsia="Arial" w:hAnsi="Arial" w:cs="Arial"/>
           <w:b/>
@@ -8561,6 +8874,7 @@
           <w:between w:val="nil"/>
         </w:pBdr>
         <w:ind w:left="720"/>
+        <w:jc w:val="both"/>
         <w:rPr>
           <w:rFonts w:ascii="Arial" w:eastAsia="Arial" w:hAnsi="Arial" w:cs="Arial"/>
         </w:rPr>
@@ -8572,22 +8886,27 @@
           <w:bCs/>
           <w:color w:val="000000"/>
         </w:rPr>
-        <w:t>Descrição:</w:t>
-      </w:r>
-      <w:r>
-        <w:rPr>
-          <w:rFonts w:ascii="Arial" w:eastAsia="Arial" w:hAnsi="Arial" w:cs="Arial"/>
-          <w:b/>
-          <w:bCs/>
-          <w:color w:val="000000"/>
-        </w:rPr>
-        <w:t xml:space="preserve"> </w:t>
-      </w:r>
-      <w:r>
-        <w:rPr>
-          <w:rFonts w:ascii="Arial" w:eastAsia="Arial" w:hAnsi="Arial" w:cs="Arial"/>
-        </w:rPr>
-        <w:t>Interface responsiva construída em Bootstrap5, com componentes de busca dinâmica Tom Select e formulários com feedback contextual.</w:t>
+        <w:t xml:space="preserve">Descrição: </w:t>
+      </w:r>
+      <w:r>
+        <w:rPr>
+          <w:rFonts w:ascii="Arial" w:eastAsia="Arial" w:hAnsi="Arial" w:cs="Arial"/>
+        </w:rPr>
+        <w:t xml:space="preserve">Interface responsiva construída em Bootstrap5, com componentes de busca dinâmica Tom </w:t>
+      </w:r>
+      <w:proofErr w:type="spellStart"/>
+      <w:r>
+        <w:rPr>
+          <w:rFonts w:ascii="Arial" w:eastAsia="Arial" w:hAnsi="Arial" w:cs="Arial"/>
+        </w:rPr>
+        <w:t>Select</w:t>
+      </w:r>
+      <w:proofErr w:type="spellEnd"/>
+      <w:r>
+        <w:rPr>
+          <w:rFonts w:ascii="Arial" w:eastAsia="Arial" w:hAnsi="Arial" w:cs="Arial"/>
+        </w:rPr>
+        <w:t xml:space="preserve"> e formulários com feedback contextual.</w:t>
       </w:r>
     </w:p>
     <w:p>
@@ -8600,6 +8919,7 @@
           <w:between w:val="nil"/>
         </w:pBdr>
         <w:ind w:left="720"/>
+        <w:jc w:val="both"/>
         <w:rPr>
           <w:rFonts w:ascii="Arial" w:eastAsia="Arial" w:hAnsi="Arial" w:cs="Arial"/>
         </w:rPr>
@@ -8615,6 +8935,7 @@
           <w:between w:val="nil"/>
         </w:pBdr>
         <w:ind w:left="720"/>
+        <w:jc w:val="both"/>
         <w:rPr>
           <w:rFonts w:ascii="Arial" w:eastAsia="Arial" w:hAnsi="Arial" w:cs="Arial"/>
         </w:rPr>
@@ -8636,6 +8957,7 @@
           <w:between w:val="nil"/>
         </w:pBdr>
         <w:ind w:left="720"/>
+        <w:jc w:val="both"/>
         <w:rPr>
           <w:rFonts w:ascii="Arial" w:eastAsia="Arial" w:hAnsi="Arial" w:cs="Arial"/>
         </w:rPr>
@@ -8655,6 +8977,7 @@
           <w:right w:val="nil"/>
           <w:between w:val="nil"/>
         </w:pBdr>
+        <w:jc w:val="both"/>
         <w:rPr>
           <w:rFonts w:ascii="Arial" w:eastAsia="Arial" w:hAnsi="Arial" w:cs="Arial"/>
           <w:b/>
@@ -8688,6 +9011,7 @@
           <w:between w:val="nil"/>
         </w:pBdr>
         <w:ind w:left="360"/>
+        <w:jc w:val="both"/>
         <w:rPr>
           <w:rFonts w:ascii="Arial" w:eastAsia="Arial" w:hAnsi="Arial" w:cs="Arial"/>
         </w:rPr>
@@ -8699,23 +9023,43 @@
           <w:bCs/>
           <w:color w:val="000000"/>
         </w:rPr>
-        <w:lastRenderedPageBreak/>
-        <w:t>Descrição:</w:t>
-      </w:r>
-      <w:r>
-        <w:rPr>
-          <w:rFonts w:ascii="Arial" w:eastAsia="Arial" w:hAnsi="Arial" w:cs="Arial"/>
-          <w:b/>
-          <w:bCs/>
-          <w:color w:val="000000"/>
-        </w:rPr>
-        <w:t xml:space="preserve">  </w:t>
-      </w:r>
-      <w:r>
-        <w:rPr>
-          <w:rFonts w:ascii="Arial" w:eastAsia="Arial" w:hAnsi="Arial" w:cs="Arial"/>
-        </w:rPr>
-        <w:t>Regras de obrigatoriedade, formato de e-mail e máscaras de CPF e telefone devem ser validadas via Bean Validation (jakarta.validation).</w:t>
+        <w:t xml:space="preserve">Descrição:  </w:t>
+      </w:r>
+      <w:r>
+        <w:rPr>
+          <w:rFonts w:ascii="Arial" w:eastAsia="Arial" w:hAnsi="Arial" w:cs="Arial"/>
+        </w:rPr>
+        <w:t xml:space="preserve">Regras de obrigatoriedade, formato de e-mail e máscaras de CPF e telefone devem ser validadas via Bean </w:t>
+      </w:r>
+      <w:proofErr w:type="spellStart"/>
+      <w:r>
+        <w:rPr>
+          <w:rFonts w:ascii="Arial" w:eastAsia="Arial" w:hAnsi="Arial" w:cs="Arial"/>
+        </w:rPr>
+        <w:t>Validation</w:t>
+      </w:r>
+      <w:proofErr w:type="spellEnd"/>
+      <w:r>
+        <w:rPr>
+          <w:rFonts w:ascii="Arial" w:eastAsia="Arial" w:hAnsi="Arial" w:cs="Arial"/>
+        </w:rPr>
+        <w:t xml:space="preserve"> (</w:t>
+      </w:r>
+      <w:proofErr w:type="spellStart"/>
+      <w:proofErr w:type="gramStart"/>
+      <w:r>
+        <w:rPr>
+          <w:rFonts w:ascii="Arial" w:eastAsia="Arial" w:hAnsi="Arial" w:cs="Arial"/>
+        </w:rPr>
+        <w:t>jakarta.validation</w:t>
+      </w:r>
+      <w:proofErr w:type="spellEnd"/>
+      <w:proofErr w:type="gramEnd"/>
+      <w:r>
+        <w:rPr>
+          <w:rFonts w:ascii="Arial" w:eastAsia="Arial" w:hAnsi="Arial" w:cs="Arial"/>
+        </w:rPr>
+        <w:t>).</w:t>
       </w:r>
     </w:p>
     <w:p>
@@ -8728,6 +9072,7 @@
           <w:between w:val="nil"/>
         </w:pBdr>
         <w:ind w:left="360"/>
+        <w:jc w:val="both"/>
         <w:rPr>
           <w:rFonts w:ascii="Arial" w:eastAsia="Arial" w:hAnsi="Arial" w:cs="Arial"/>
         </w:rPr>
@@ -8743,6 +9088,7 @@
           <w:between w:val="nil"/>
         </w:pBdr>
         <w:ind w:left="360"/>
+        <w:jc w:val="both"/>
         <w:rPr>
           <w:rFonts w:ascii="Arial" w:eastAsia="Arial" w:hAnsi="Arial" w:cs="Arial"/>
         </w:rPr>
@@ -8772,6 +9118,7 @@
           <w:between w:val="nil"/>
         </w:pBdr>
         <w:ind w:left="360"/>
+        <w:jc w:val="both"/>
         <w:rPr>
           <w:rFonts w:ascii="Arial" w:eastAsia="Arial" w:hAnsi="Arial" w:cs="Arial"/>
         </w:rPr>
@@ -8791,6 +9138,7 @@
           <w:right w:val="nil"/>
           <w:between w:val="nil"/>
         </w:pBdr>
+        <w:jc w:val="both"/>
         <w:rPr>
           <w:rFonts w:ascii="Arial" w:eastAsia="Arial" w:hAnsi="Arial" w:cs="Arial"/>
           <w:b/>
@@ -8816,6 +9164,7 @@
           <w:between w:val="nil"/>
         </w:pBdr>
         <w:ind w:left="360"/>
+        <w:jc w:val="both"/>
         <w:rPr>
           <w:rFonts w:ascii="Arial" w:eastAsia="Arial" w:hAnsi="Arial" w:cs="Arial"/>
         </w:rPr>
@@ -8831,6 +9180,7 @@
           <w:between w:val="nil"/>
         </w:pBdr>
         <w:ind w:left="360"/>
+        <w:jc w:val="both"/>
         <w:rPr>
           <w:rFonts w:ascii="Arial" w:eastAsia="Arial" w:hAnsi="Arial" w:cs="Arial"/>
         </w:rPr>
@@ -8842,16 +9192,7 @@
           <w:bCs/>
           <w:color w:val="000000"/>
         </w:rPr>
-        <w:t>Descrição:</w:t>
-      </w:r>
-      <w:r>
-        <w:rPr>
-          <w:rFonts w:ascii="Arial" w:eastAsia="Arial" w:hAnsi="Arial" w:cs="Arial"/>
-          <w:b/>
-          <w:bCs/>
-          <w:color w:val="000000"/>
-        </w:rPr>
-        <w:t xml:space="preserve"> </w:t>
+        <w:t xml:space="preserve">Descrição: </w:t>
       </w:r>
       <w:r>
         <w:rPr>
@@ -8870,6 +9211,7 @@
           <w:between w:val="nil"/>
         </w:pBdr>
         <w:ind w:left="360"/>
+        <w:jc w:val="both"/>
         <w:rPr>
           <w:rFonts w:ascii="Arial" w:eastAsia="Arial" w:hAnsi="Arial" w:cs="Arial"/>
         </w:rPr>
@@ -8885,6 +9227,7 @@
           <w:between w:val="nil"/>
         </w:pBdr>
         <w:ind w:left="360"/>
+        <w:jc w:val="both"/>
         <w:rPr>
           <w:rFonts w:ascii="Arial" w:eastAsia="Arial" w:hAnsi="Arial" w:cs="Arial"/>
         </w:rPr>
@@ -8914,6 +9257,7 @@
           <w:between w:val="nil"/>
         </w:pBdr>
         <w:ind w:left="360"/>
+        <w:jc w:val="both"/>
         <w:rPr>
           <w:rFonts w:ascii="Arial" w:eastAsia="Arial" w:hAnsi="Arial" w:cs="Arial"/>
         </w:rPr>
@@ -8933,6 +9277,7 @@
           <w:right w:val="nil"/>
           <w:between w:val="nil"/>
         </w:pBdr>
+        <w:jc w:val="both"/>
         <w:rPr>
           <w:rFonts w:ascii="Arial" w:eastAsia="Arial" w:hAnsi="Arial" w:cs="Arial"/>
           <w:b/>
@@ -8958,6 +9303,7 @@
           <w:between w:val="nil"/>
         </w:pBdr>
         <w:ind w:left="360"/>
+        <w:jc w:val="both"/>
         <w:rPr>
           <w:rFonts w:ascii="Arial" w:eastAsia="Arial" w:hAnsi="Arial" w:cs="Arial"/>
         </w:rPr>
@@ -8973,6 +9319,7 @@
           <w:between w:val="nil"/>
         </w:pBdr>
         <w:ind w:left="360"/>
+        <w:jc w:val="both"/>
         <w:rPr>
           <w:rFonts w:ascii="Arial" w:eastAsia="Arial" w:hAnsi="Arial" w:cs="Arial"/>
         </w:rPr>
@@ -8984,16 +9331,7 @@
           <w:bCs/>
           <w:color w:val="000000"/>
         </w:rPr>
-        <w:t>Descrição:</w:t>
-      </w:r>
-      <w:r>
-        <w:rPr>
-          <w:rFonts w:ascii="Arial" w:eastAsia="Arial" w:hAnsi="Arial" w:cs="Arial"/>
-          <w:b/>
-          <w:bCs/>
-          <w:color w:val="000000"/>
-        </w:rPr>
-        <w:t xml:space="preserve"> </w:t>
+        <w:t xml:space="preserve">Descrição: </w:t>
       </w:r>
       <w:r>
         <w:rPr>
@@ -9012,6 +9350,7 @@
           <w:between w:val="nil"/>
         </w:pBdr>
         <w:ind w:left="360"/>
+        <w:jc w:val="both"/>
         <w:rPr>
           <w:rFonts w:ascii="Arial" w:eastAsia="Arial" w:hAnsi="Arial" w:cs="Arial"/>
         </w:rPr>
@@ -9027,6 +9366,7 @@
           <w:between w:val="nil"/>
         </w:pBdr>
         <w:ind w:left="360"/>
+        <w:jc w:val="both"/>
         <w:rPr>
           <w:rFonts w:ascii="Arial" w:eastAsia="Arial" w:hAnsi="Arial" w:cs="Arial"/>
         </w:rPr>
@@ -9056,6 +9396,7 @@
           <w:between w:val="nil"/>
         </w:pBdr>
         <w:ind w:firstLine="360"/>
+        <w:jc w:val="both"/>
         <w:rPr>
           <w:rFonts w:ascii="Arial" w:eastAsia="Arial" w:hAnsi="Arial" w:cs="Arial"/>
           <w:b/>
@@ -9073,6 +9414,7 @@
           <w:between w:val="nil"/>
         </w:pBdr>
         <w:ind w:firstLine="360"/>
+        <w:jc w:val="both"/>
         <w:rPr>
           <w:rFonts w:ascii="Arial" w:eastAsia="Arial" w:hAnsi="Arial" w:cs="Arial"/>
         </w:rPr>
@@ -9104,6 +9446,7 @@
           <w:right w:val="nil"/>
           <w:between w:val="nil"/>
         </w:pBdr>
+        <w:jc w:val="both"/>
         <w:rPr>
           <w:rFonts w:ascii="Arial" w:eastAsia="Arial" w:hAnsi="Arial" w:cs="Arial"/>
           <w:b/>
@@ -9121,6 +9464,7 @@
           <w:between w:val="nil"/>
         </w:pBdr>
         <w:ind w:left="360"/>
+        <w:jc w:val="both"/>
         <w:rPr>
           <w:rFonts w:ascii="Arial" w:eastAsia="Arial" w:hAnsi="Arial" w:cs="Arial"/>
         </w:rPr>
@@ -9132,22 +9476,41 @@
           <w:bCs/>
           <w:color w:val="000000"/>
         </w:rPr>
-        <w:t>Descrição:</w:t>
-      </w:r>
-      <w:r>
-        <w:rPr>
-          <w:rFonts w:ascii="Arial" w:eastAsia="Arial" w:hAnsi="Arial" w:cs="Arial"/>
-          <w:b/>
-          <w:bCs/>
-          <w:color w:val="000000"/>
-        </w:rPr>
-        <w:t xml:space="preserve"> </w:t>
-      </w:r>
-      <w:r>
-        <w:rPr>
-          <w:rFonts w:ascii="Arial" w:eastAsia="Arial" w:hAnsi="Arial" w:cs="Arial"/>
-        </w:rPr>
-        <w:t>A emissão de relatórios e recibos deve utilizar o motor OpenHTMLtoPDF om CSS Paged Media (@page), gerando documentos A4 padronizados com numeração de páginas automática</w:t>
+        <w:t xml:space="preserve">Descrição: </w:t>
+      </w:r>
+      <w:r>
+        <w:rPr>
+          <w:rFonts w:ascii="Arial" w:eastAsia="Arial" w:hAnsi="Arial" w:cs="Arial"/>
+        </w:rPr>
+        <w:t xml:space="preserve">A emissão de relatórios e recibos deve utilizar o motor </w:t>
+      </w:r>
+      <w:proofErr w:type="spellStart"/>
+      <w:r>
+        <w:rPr>
+          <w:rFonts w:ascii="Arial" w:eastAsia="Arial" w:hAnsi="Arial" w:cs="Arial"/>
+        </w:rPr>
+        <w:t>OpenHTMLtoPDF</w:t>
+      </w:r>
+      <w:proofErr w:type="spellEnd"/>
+      <w:r>
+        <w:rPr>
+          <w:rFonts w:ascii="Arial" w:eastAsia="Arial" w:hAnsi="Arial" w:cs="Arial"/>
+        </w:rPr>
+        <w:t xml:space="preserve"> om CSS </w:t>
+      </w:r>
+      <w:proofErr w:type="spellStart"/>
+      <w:r>
+        <w:rPr>
+          <w:rFonts w:ascii="Arial" w:eastAsia="Arial" w:hAnsi="Arial" w:cs="Arial"/>
+        </w:rPr>
+        <w:t>Paged</w:t>
+      </w:r>
+      <w:proofErr w:type="spellEnd"/>
+      <w:r>
+        <w:rPr>
+          <w:rFonts w:ascii="Arial" w:eastAsia="Arial" w:hAnsi="Arial" w:cs="Arial"/>
+        </w:rPr>
+        <w:t xml:space="preserve"> Media (@page), gerando documentos A4 padronizados com numeração de páginas automática</w:t>
       </w:r>
     </w:p>
     <w:p>
@@ -9160,6 +9523,7 @@
           <w:between w:val="nil"/>
         </w:pBdr>
         <w:ind w:left="360"/>
+        <w:jc w:val="both"/>
         <w:rPr>
           <w:rFonts w:ascii="Arial" w:eastAsia="Arial" w:hAnsi="Arial" w:cs="Arial"/>
           <w:b/>
@@ -9177,6 +9541,7 @@
           <w:between w:val="nil"/>
         </w:pBdr>
         <w:ind w:left="360"/>
+        <w:jc w:val="both"/>
         <w:rPr>
           <w:rFonts w:ascii="Arial" w:eastAsia="Arial" w:hAnsi="Arial" w:cs="Arial"/>
         </w:rPr>
@@ -9195,22 +9560,6 @@
         </w:rPr>
         <w:t xml:space="preserve"> Importante.</w:t>
       </w:r>
-    </w:p>
-    <w:p>
-      <w:pPr>
-        <w:pBdr>
-          <w:top w:val="nil"/>
-          <w:left w:val="nil"/>
-          <w:bottom w:val="nil"/>
-          <w:right w:val="nil"/>
-          <w:between w:val="nil"/>
-        </w:pBdr>
-        <w:ind w:left="601"/>
-        <w:rPr>
-          <w:rFonts w:ascii="Arial" w:eastAsia="Arial" w:hAnsi="Arial" w:cs="Arial"/>
-          <w:color w:val="000000"/>
-        </w:rPr>
-      </w:pPr>
     </w:p>
     <w:p>
       <w:pPr>
@@ -9332,6 +9681,7 @@
           <w:right w:val="nil"/>
           <w:between w:val="nil"/>
         </w:pBdr>
+        <w:jc w:val="both"/>
         <w:rPr>
           <w:rFonts w:ascii="Arial" w:hAnsi="Arial" w:cs="Arial"/>
         </w:rPr>
@@ -9348,7 +9698,21 @@
         <w:rPr>
           <w:rFonts w:ascii="Arial" w:hAnsi="Arial" w:cs="Arial"/>
         </w:rPr>
-        <w:t xml:space="preserve"> Entidades de dados mapeadas (Cliente, Produto, Pedido, etc.).</w:t>
+        <w:t xml:space="preserve"> Entidades de dados mapeadas (Cliente, Produto, </w:t>
+      </w:r>
+      <w:proofErr w:type="gramStart"/>
+      <w:r>
+        <w:rPr>
+          <w:rFonts w:ascii="Arial" w:hAnsi="Arial" w:cs="Arial"/>
+        </w:rPr>
+        <w:t>Pedido, etc.</w:t>
+      </w:r>
+      <w:proofErr w:type="gramEnd"/>
+      <w:r>
+        <w:rPr>
+          <w:rFonts w:ascii="Arial" w:hAnsi="Arial" w:cs="Arial"/>
+        </w:rPr>
+        <w:t>).</w:t>
       </w:r>
     </w:p>
     <w:p>
@@ -9366,10 +9730,12 @@
           <w:right w:val="nil"/>
           <w:between w:val="nil"/>
         </w:pBdr>
+        <w:jc w:val="both"/>
         <w:rPr>
           <w:rFonts w:ascii="Arial" w:hAnsi="Arial" w:cs="Arial"/>
         </w:rPr>
       </w:pPr>
+      <w:proofErr w:type="spellStart"/>
       <w:r>
         <w:rPr>
           <w:rFonts w:ascii="Arial" w:hAnsi="Arial" w:cs="Arial"/>
@@ -9384,7 +9750,34 @@
           <w:b/>
           <w:bCs/>
         </w:rPr>
-        <w:t xml:space="preserve">epositories (JpaRepository): </w:t>
+        <w:t>epositories</w:t>
+      </w:r>
+      <w:proofErr w:type="spellEnd"/>
+      <w:r>
+        <w:rPr>
+          <w:rFonts w:ascii="Arial" w:hAnsi="Arial" w:cs="Arial"/>
+          <w:b/>
+          <w:bCs/>
+        </w:rPr>
+        <w:t xml:space="preserve"> (</w:t>
+      </w:r>
+      <w:proofErr w:type="spellStart"/>
+      <w:r>
+        <w:rPr>
+          <w:rFonts w:ascii="Arial" w:hAnsi="Arial" w:cs="Arial"/>
+          <w:b/>
+          <w:bCs/>
+        </w:rPr>
+        <w:t>JpaRepository</w:t>
+      </w:r>
+      <w:proofErr w:type="spellEnd"/>
+      <w:r>
+        <w:rPr>
+          <w:rFonts w:ascii="Arial" w:hAnsi="Arial" w:cs="Arial"/>
+          <w:b/>
+          <w:bCs/>
+        </w:rPr>
+        <w:t xml:space="preserve">): </w:t>
       </w:r>
       <w:r>
         <w:rPr>
@@ -9408,10 +9801,12 @@
           <w:right w:val="nil"/>
           <w:between w:val="nil"/>
         </w:pBdr>
+        <w:jc w:val="both"/>
         <w:rPr>
           <w:rFonts w:ascii="Arial" w:hAnsi="Arial" w:cs="Arial"/>
         </w:rPr>
       </w:pPr>
+      <w:proofErr w:type="spellStart"/>
       <w:r>
         <w:rPr>
           <w:rFonts w:ascii="Arial" w:hAnsi="Arial" w:cs="Arial"/>
@@ -9426,11 +9821,20 @@
           <w:b/>
           <w:bCs/>
         </w:rPr>
-        <w:t>ervice:</w:t>
-      </w:r>
+        <w:t>ervice</w:t>
+      </w:r>
+      <w:proofErr w:type="spellEnd"/>
       <w:r>
         <w:rPr>
           <w:rFonts w:ascii="Arial" w:hAnsi="Arial" w:cs="Arial"/>
+          <w:b/>
+          <w:bCs/>
+        </w:rPr>
+        <w:t>:</w:t>
+      </w:r>
+      <w:r>
+        <w:rPr>
+          <w:rFonts w:ascii="Arial" w:hAnsi="Arial" w:cs="Arial"/>
         </w:rPr>
         <w:t xml:space="preserve"> </w:t>
       </w:r>
@@ -9438,13 +9842,55 @@
         <w:rPr>
           <w:rFonts w:ascii="Arial" w:hAnsi="Arial" w:cs="Arial"/>
         </w:rPr>
-        <w:t>(@Service / @Transactional): Executam regras de negócio como a validação e abatimento atômico do estoque na criação de um pedido, cálculo de subtotais e geração de PDFs com a biblioteca iText.</w:t>
-      </w:r>
+        <w:t xml:space="preserve">(@Service / @Transactional): Executam regras de negócio como a validação e abatimento atômico do estoque na criação de um pedido, cálculo de subtotais e geração de </w:t>
+      </w:r>
+      <w:proofErr w:type="spellStart"/>
       <w:r>
         <w:rPr>
           <w:rFonts w:ascii="Arial" w:hAnsi="Arial" w:cs="Arial"/>
         </w:rPr>
-        <w:t>controller: Roteamento HTTP, tratamento de validações e alimentação das views.</w:t>
+        <w:t>PDFs</w:t>
+      </w:r>
+      <w:proofErr w:type="spellEnd"/>
+      <w:r>
+        <w:rPr>
+          <w:rFonts w:ascii="Arial" w:hAnsi="Arial" w:cs="Arial"/>
+        </w:rPr>
+        <w:t xml:space="preserve"> com a biblioteca </w:t>
+      </w:r>
+      <w:proofErr w:type="spellStart"/>
+      <w:r>
+        <w:rPr>
+          <w:rFonts w:ascii="Arial" w:hAnsi="Arial" w:cs="Arial"/>
+        </w:rPr>
+        <w:t>iText.</w:t>
+      </w:r>
+      <w:r>
+        <w:rPr>
+          <w:rFonts w:ascii="Arial" w:hAnsi="Arial" w:cs="Arial"/>
+        </w:rPr>
+        <w:t>controller</w:t>
+      </w:r>
+      <w:proofErr w:type="spellEnd"/>
+      <w:r>
+        <w:rPr>
+          <w:rFonts w:ascii="Arial" w:hAnsi="Arial" w:cs="Arial"/>
+        </w:rPr>
+        <w:t xml:space="preserve">: Roteamento HTTP, tratamento de validações e alimentação das </w:t>
+      </w:r>
+      <w:proofErr w:type="spellStart"/>
+      <w:r>
+        <w:rPr>
+          <w:rFonts w:ascii="Arial" w:hAnsi="Arial" w:cs="Arial"/>
+        </w:rPr>
+        <w:t>views</w:t>
+      </w:r>
+      <w:proofErr w:type="spellEnd"/>
+      <w:r>
+        <w:rPr>
+          <w:rFonts w:ascii="Arial" w:hAnsi="Arial" w:cs="Arial"/>
+        </w:rPr>
+        <w:t>.</w:t>
       </w:r>
     </w:p>
     <w:p>
@@ -9462,17 +9908,28 @@
           <w:right w:val="nil"/>
           <w:between w:val="nil"/>
         </w:pBdr>
+        <w:jc w:val="both"/>
         <w:rPr>
           <w:rFonts w:ascii="Arial" w:hAnsi="Arial" w:cs="Arial"/>
         </w:rPr>
       </w:pPr>
+      <w:proofErr w:type="spellStart"/>
       <w:r>
         <w:rPr>
           <w:rFonts w:ascii="Arial" w:hAnsi="Arial" w:cs="Arial"/>
           <w:b/>
           <w:bCs/>
         </w:rPr>
-        <w:t>config:</w:t>
+        <w:t>config</w:t>
+      </w:r>
+      <w:proofErr w:type="spellEnd"/>
+      <w:r>
+        <w:rPr>
+          <w:rFonts w:ascii="Arial" w:hAnsi="Arial" w:cs="Arial"/>
+          <w:b/>
+          <w:bCs/>
+        </w:rPr>
+        <w:t>:</w:t>
       </w:r>
       <w:r>
         <w:rPr>
@@ -9496,10 +9953,12 @@
           <w:right w:val="nil"/>
           <w:between w:val="nil"/>
         </w:pBdr>
+        <w:jc w:val="both"/>
         <w:rPr>
           <w:rFonts w:ascii="Arial" w:hAnsi="Arial" w:cs="Arial"/>
         </w:rPr>
       </w:pPr>
+      <w:proofErr w:type="spellStart"/>
       <w:r>
         <w:rPr>
           <w:rFonts w:ascii="Arial" w:hAnsi="Arial" w:cs="Arial"/>
@@ -9514,13 +9973,64 @@
           <w:b/>
           <w:bCs/>
         </w:rPr>
-        <w:t xml:space="preserve">ontrollers (@Controller): </w:t>
-      </w:r>
+        <w:t>ontrollers</w:t>
+      </w:r>
+      <w:proofErr w:type="spellEnd"/>
       <w:r>
         <w:rPr>
           <w:rFonts w:ascii="Arial" w:hAnsi="Arial" w:cs="Arial"/>
-        </w:rPr>
-        <w:t>Recebem requisições HTTP, efetuam validações (@NotBlank, @Email) e enviam dados para serem renderizados pelas views Thymeleaf com componentes Bootstrap 5.</w:t>
+          <w:b/>
+          <w:bCs/>
+        </w:rPr>
+        <w:t xml:space="preserve"> (@Controller): </w:t>
+      </w:r>
+      <w:r>
+        <w:rPr>
+          <w:rFonts w:ascii="Arial" w:hAnsi="Arial" w:cs="Arial"/>
+        </w:rPr>
+        <w:t xml:space="preserve">Recebem requisições HTTP, efetuam validações (@NotBlank, @Email) e enviam dados para serem renderizados pelas </w:t>
+      </w:r>
+      <w:proofErr w:type="spellStart"/>
+      <w:r>
+        <w:rPr>
+          <w:rFonts w:ascii="Arial" w:hAnsi="Arial" w:cs="Arial"/>
+        </w:rPr>
+        <w:t>views</w:t>
+      </w:r>
+      <w:proofErr w:type="spellEnd"/>
+      <w:r>
+        <w:rPr>
+          <w:rFonts w:ascii="Arial" w:hAnsi="Arial" w:cs="Arial"/>
+        </w:rPr>
+        <w:t xml:space="preserve"> </w:t>
+      </w:r>
+      <w:proofErr w:type="spellStart"/>
+      <w:r>
+        <w:rPr>
+          <w:rFonts w:ascii="Arial" w:hAnsi="Arial" w:cs="Arial"/>
+        </w:rPr>
+        <w:t>Thymeleaf</w:t>
+      </w:r>
+      <w:proofErr w:type="spellEnd"/>
+      <w:r>
+        <w:rPr>
+          <w:rFonts w:ascii="Arial" w:hAnsi="Arial" w:cs="Arial"/>
+        </w:rPr>
+        <w:t xml:space="preserve"> com componentes </w:t>
+      </w:r>
+      <w:proofErr w:type="spellStart"/>
+      <w:r>
+        <w:rPr>
+          <w:rFonts w:ascii="Arial" w:hAnsi="Arial" w:cs="Arial"/>
+        </w:rPr>
+        <w:t>Bootstrap</w:t>
+      </w:r>
+      <w:proofErr w:type="spellEnd"/>
+      <w:r>
+        <w:rPr>
+          <w:rFonts w:ascii="Arial" w:hAnsi="Arial" w:cs="Arial"/>
+        </w:rPr>
+        <w:t xml:space="preserve"> 5.</w:t>
       </w:r>
     </w:p>
     <w:p>
@@ -9544,6 +10054,42 @@
         <w:pStyle w:val="Ttulo1"/>
       </w:pPr>
       <w:bookmarkStart w:id="28" w:name="_Toc238480117"/>
+    </w:p>
+    <w:p>
+      <w:pPr>
+        <w:pStyle w:val="Ttulo1"/>
+      </w:pPr>
+    </w:p>
+    <w:p>
+      <w:pPr>
+        <w:pStyle w:val="Ttulo1"/>
+      </w:pPr>
+    </w:p>
+    <w:p>
+      <w:pPr>
+        <w:pStyle w:val="Ttulo1"/>
+      </w:pPr>
+    </w:p>
+    <w:p>
+      <w:pPr>
+        <w:pStyle w:val="Ttulo1"/>
+      </w:pPr>
+    </w:p>
+    <w:p/>
+    <w:p>
+      <w:pPr>
+        <w:pStyle w:val="Ttulo1"/>
+      </w:pPr>
+    </w:p>
+    <w:p>
+      <w:pPr>
+        <w:pStyle w:val="Ttulo1"/>
+      </w:pPr>
+    </w:p>
+    <w:p>
+      <w:pPr>
+        <w:pStyle w:val="Ttulo1"/>
+      </w:pPr>
       <w:r>
         <w:t>Diagrama de Pacotes</w:t>
       </w:r>
@@ -9579,8 +10125,6 @@
           <w:between w:val="nil"/>
         </w:pBdr>
         <w:rPr>
-          <w:i/>
-          <w:iCs/>
           <w:color w:val="FF0000"/>
           <w:sz w:val="22"/>
           <w:szCs w:val="22"/>
@@ -9588,19 +10132,16 @@
       </w:pPr>
       <w:r>
         <w:rPr>
-          <w:i/>
-          <w:iCs/>
           <w:noProof/>
           <w:color w:val="FF0000"/>
           <w:sz w:val="22"/>
           <w:szCs w:val="22"/>
         </w:rPr>
-        <w:lastRenderedPageBreak/>
         <w:drawing>
-          <wp:inline distT="0" distB="0" distL="0" distR="0" wp14:anchorId="137B775C" wp14:editId="2AC8F3F2">
-            <wp:extent cx="5605145" cy="4673600"/>
+          <wp:inline distT="0" distB="0" distL="0" distR="0" wp14:anchorId="06D901E8" wp14:editId="3FC33228">
+            <wp:extent cx="5612130" cy="5723890"/>
             <wp:effectExtent l="0" t="0" r="0" b="0"/>
-            <wp:docPr id="1945524213" name="Imagem 3"/>
+            <wp:docPr id="1282108935" name="Imagem 1"/>
             <wp:cNvGraphicFramePr>
               <a:graphicFrameLocks xmlns:a="http://schemas.openxmlformats.org/drawingml/2006/main" noChangeAspect="1"/>
             </wp:cNvGraphicFramePr>
@@ -9608,36 +10149,29 @@
               <a:graphicData uri="http://schemas.openxmlformats.org/drawingml/2006/picture">
                 <pic:pic xmlns:pic="http://schemas.openxmlformats.org/drawingml/2006/picture">
                   <pic:nvPicPr>
-                    <pic:cNvPr id="0" name="Picture 4"/>
-                    <pic:cNvPicPr>
-                      <a:picLocks noChangeAspect="1" noChangeArrowheads="1"/>
-                    </pic:cNvPicPr>
+                    <pic:cNvPr id="1282108935" name="Imagem 1282108935"/>
+                    <pic:cNvPicPr/>
                   </pic:nvPicPr>
                   <pic:blipFill>
-                    <a:blip r:embed="rId11">
+                    <a:blip r:embed="rId11" cstate="print">
                       <a:extLst>
                         <a:ext uri="{28A0092B-C50C-407E-A947-70E740481C1C}">
                           <a14:useLocalDpi xmlns:a14="http://schemas.microsoft.com/office/drawing/2010/main" val="0"/>
                         </a:ext>
                       </a:extLst>
                     </a:blip>
-                    <a:srcRect/>
                     <a:stretch>
                       <a:fillRect/>
                     </a:stretch>
                   </pic:blipFill>
-                  <pic:spPr bwMode="auto">
+                  <pic:spPr>
                     <a:xfrm>
                       <a:off x="0" y="0"/>
-                      <a:ext cx="5605145" cy="4673600"/>
+                      <a:ext cx="5612130" cy="5723890"/>
                     </a:xfrm>
                     <a:prstGeom prst="rect">
                       <a:avLst/>
                     </a:prstGeom>
-                    <a:noFill/>
-                    <a:ln>
-                      <a:noFill/>
-                    </a:ln>
                   </pic:spPr>
                 </pic:pic>
               </a:graphicData>
@@ -9745,7 +10279,7 @@
                 <w:between w:val="nil"/>
               </w:pBdr>
               <w:spacing w:after="120"/>
-              <w:jc w:val="center"/>
+              <w:jc w:val="both"/>
               <w:rPr>
                 <w:rFonts w:ascii="Arial" w:eastAsia="Arial" w:hAnsi="Arial" w:cs="Arial"/>
                 <w:b/>
@@ -9788,7 +10322,7 @@
                 <w:between w:val="nil"/>
               </w:pBdr>
               <w:spacing w:after="120"/>
-              <w:jc w:val="center"/>
+              <w:jc w:val="both"/>
               <w:rPr>
                 <w:rFonts w:ascii="Arial" w:eastAsia="Arial" w:hAnsi="Arial" w:cs="Arial"/>
                 <w:b/>
@@ -9831,7 +10365,7 @@
                 <w:between w:val="nil"/>
               </w:pBdr>
               <w:spacing w:after="120"/>
-              <w:jc w:val="center"/>
+              <w:jc w:val="both"/>
               <w:rPr>
                 <w:rFonts w:ascii="Arial" w:eastAsia="Arial" w:hAnsi="Arial" w:cs="Arial"/>
                 <w:b/>
@@ -9874,7 +10408,7 @@
                 <w:between w:val="nil"/>
               </w:pBdr>
               <w:spacing w:after="120"/>
-              <w:jc w:val="center"/>
+              <w:jc w:val="both"/>
               <w:rPr>
                 <w:rFonts w:ascii="Arial" w:eastAsia="Arial" w:hAnsi="Arial" w:cs="Arial"/>
                 <w:b/>
@@ -9913,6 +10447,7 @@
                 <w:between w:val="nil"/>
               </w:pBdr>
               <w:spacing w:after="120"/>
+              <w:jc w:val="both"/>
               <w:rPr>
                 <w:rFonts w:ascii="Arial" w:eastAsia="Arial" w:hAnsi="Arial" w:cs="Arial"/>
                 <w:b/>
@@ -9960,6 +10495,7 @@
                 <w:between w:val="nil"/>
               </w:pBdr>
               <w:spacing w:after="120"/>
+              <w:jc w:val="both"/>
               <w:rPr>
                 <w:rFonts w:ascii="Arial" w:hAnsi="Arial" w:cs="Arial"/>
                 <w:color w:val="000000"/>
@@ -9994,6 +10530,7 @@
                 <w:between w:val="nil"/>
               </w:pBdr>
               <w:spacing w:after="120"/>
+              <w:jc w:val="both"/>
               <w:rPr>
                 <w:rFonts w:ascii="Arial" w:hAnsi="Arial" w:cs="Arial"/>
                 <w:color w:val="000000"/>
@@ -10004,7 +10541,23 @@
                 <w:rFonts w:ascii="Arial" w:hAnsi="Arial" w:cs="Arial"/>
                 <w:color w:val="000000"/>
               </w:rPr>
-              <w:t>Modelagem relacional, diagrama E-R e script DDL/DML (prototech_db)</w:t>
+              <w:t>Modelagem relacional, diagrama E-R e script DDL/DML (</w:t>
+            </w:r>
+            <w:proofErr w:type="spellStart"/>
+            <w:r>
+              <w:rPr>
+                <w:rFonts w:ascii="Arial" w:hAnsi="Arial" w:cs="Arial"/>
+                <w:color w:val="000000"/>
+              </w:rPr>
+              <w:t>prototech_db</w:t>
+            </w:r>
+            <w:proofErr w:type="spellEnd"/>
+            <w:r>
+              <w:rPr>
+                <w:rFonts w:ascii="Arial" w:hAnsi="Arial" w:cs="Arial"/>
+                <w:color w:val="000000"/>
+              </w:rPr>
+              <w:t>)</w:t>
             </w:r>
           </w:p>
         </w:tc>
@@ -10028,6 +10581,7 @@
                 <w:between w:val="nil"/>
               </w:pBdr>
               <w:spacing w:after="120"/>
+              <w:jc w:val="both"/>
               <w:rPr>
                 <w:rFonts w:ascii="Arial" w:hAnsi="Arial" w:cs="Arial"/>
                 <w:color w:val="000000"/>
@@ -10062,6 +10616,7 @@
                 <w:between w:val="nil"/>
               </w:pBdr>
               <w:spacing w:after="120"/>
+              <w:jc w:val="both"/>
               <w:rPr>
                 <w:rFonts w:ascii="Arial" w:hAnsi="Arial" w:cs="Arial"/>
                 <w:color w:val="000000"/>
@@ -10092,6 +10647,7 @@
                 <w:between w:val="nil"/>
               </w:pBdr>
               <w:spacing w:after="120"/>
+              <w:jc w:val="both"/>
               <w:rPr>
                 <w:rFonts w:ascii="Arial" w:hAnsi="Arial" w:cs="Arial"/>
                 <w:color w:val="000000"/>
@@ -10131,6 +10687,7 @@
                 <w:between w:val="nil"/>
               </w:pBdr>
               <w:spacing w:after="120"/>
+              <w:jc w:val="both"/>
               <w:rPr>
                 <w:rFonts w:ascii="Arial" w:hAnsi="Arial" w:cs="Arial"/>
                 <w:color w:val="000000"/>
@@ -10141,6 +10698,7 @@
                 <w:rFonts w:ascii="Arial" w:hAnsi="Arial" w:cs="Arial"/>
                 <w:color w:val="000000"/>
               </w:rPr>
+              <w:lastRenderedPageBreak/>
               <w:t>2</w:t>
             </w:r>
           </w:p>
@@ -10165,6 +10723,7 @@
                 <w:between w:val="nil"/>
               </w:pBdr>
               <w:spacing w:after="120"/>
+              <w:jc w:val="both"/>
               <w:rPr>
                 <w:rFonts w:ascii="Arial" w:hAnsi="Arial" w:cs="Arial"/>
                 <w:color w:val="000000"/>
@@ -10175,7 +10734,41 @@
                 <w:rFonts w:ascii="Arial" w:hAnsi="Arial" w:cs="Arial"/>
                 <w:color w:val="000000"/>
               </w:rPr>
-              <w:t>Estruturação Maven, configuração do application.properties e entidades @Entity.</w:t>
+              <w:t xml:space="preserve">Estruturação </w:t>
+            </w:r>
+            <w:proofErr w:type="spellStart"/>
+            <w:r>
+              <w:rPr>
+                <w:rFonts w:ascii="Arial" w:hAnsi="Arial" w:cs="Arial"/>
+                <w:color w:val="000000"/>
+              </w:rPr>
+              <w:t>Maven</w:t>
+            </w:r>
+            <w:proofErr w:type="spellEnd"/>
+            <w:r>
+              <w:rPr>
+                <w:rFonts w:ascii="Arial" w:hAnsi="Arial" w:cs="Arial"/>
+                <w:color w:val="000000"/>
+              </w:rPr>
+              <w:t xml:space="preserve">, configuração do </w:t>
+            </w:r>
+            <w:proofErr w:type="spellStart"/>
+            <w:proofErr w:type="gramStart"/>
+            <w:r>
+              <w:rPr>
+                <w:rFonts w:ascii="Arial" w:hAnsi="Arial" w:cs="Arial"/>
+                <w:color w:val="000000"/>
+              </w:rPr>
+              <w:t>application.properties</w:t>
+            </w:r>
+            <w:proofErr w:type="spellEnd"/>
+            <w:proofErr w:type="gramEnd"/>
+            <w:r>
+              <w:rPr>
+                <w:rFonts w:ascii="Arial" w:hAnsi="Arial" w:cs="Arial"/>
+                <w:color w:val="000000"/>
+              </w:rPr>
+              <w:t xml:space="preserve"> e entidades @Entity.</w:t>
             </w:r>
           </w:p>
         </w:tc>
@@ -10199,6 +10792,7 @@
                 <w:between w:val="nil"/>
               </w:pBdr>
               <w:spacing w:after="120"/>
+              <w:jc w:val="both"/>
               <w:rPr>
                 <w:rFonts w:ascii="Arial" w:hAnsi="Arial" w:cs="Arial"/>
                 <w:color w:val="000000"/>
@@ -10233,6 +10827,7 @@
                 <w:between w:val="nil"/>
               </w:pBdr>
               <w:spacing w:after="120"/>
+              <w:jc w:val="both"/>
               <w:rPr>
                 <w:rFonts w:ascii="Arial" w:hAnsi="Arial" w:cs="Arial"/>
                 <w:color w:val="000000"/>
@@ -10263,6 +10858,7 @@
                 <w:between w:val="nil"/>
               </w:pBdr>
               <w:spacing w:after="120"/>
+              <w:jc w:val="both"/>
               <w:rPr>
                 <w:rFonts w:ascii="Arial" w:hAnsi="Arial" w:cs="Arial"/>
                 <w:color w:val="000000"/>
@@ -10302,6 +10898,7 @@
                 <w:between w:val="nil"/>
               </w:pBdr>
               <w:spacing w:after="120"/>
+              <w:jc w:val="both"/>
               <w:rPr>
                 <w:rFonts w:ascii="Arial" w:hAnsi="Arial" w:cs="Arial"/>
                 <w:color w:val="000000"/>
@@ -10336,6 +10933,7 @@
                 <w:between w:val="nil"/>
               </w:pBdr>
               <w:spacing w:after="120"/>
+              <w:jc w:val="both"/>
               <w:rPr>
                 <w:rFonts w:ascii="Arial" w:hAnsi="Arial" w:cs="Arial"/>
                 <w:color w:val="000000"/>
@@ -10346,7 +10944,23 @@
                 <w:rFonts w:ascii="Arial" w:hAnsi="Arial" w:cs="Arial"/>
                 <w:color w:val="000000"/>
               </w:rPr>
-              <w:t>Implementação dos Repositories e Services com controle transacional e alertas</w:t>
+              <w:t xml:space="preserve">Implementação dos </w:t>
+            </w:r>
+            <w:proofErr w:type="spellStart"/>
+            <w:r>
+              <w:rPr>
+                <w:rFonts w:ascii="Arial" w:hAnsi="Arial" w:cs="Arial"/>
+                <w:color w:val="000000"/>
+              </w:rPr>
+              <w:t>Repositories</w:t>
+            </w:r>
+            <w:proofErr w:type="spellEnd"/>
+            <w:r>
+              <w:rPr>
+                <w:rFonts w:ascii="Arial" w:hAnsi="Arial" w:cs="Arial"/>
+                <w:color w:val="000000"/>
+              </w:rPr>
+              <w:t xml:space="preserve"> e Services com controle transacional e alertas</w:t>
             </w:r>
           </w:p>
         </w:tc>
@@ -10370,6 +10984,7 @@
                 <w:between w:val="nil"/>
               </w:pBdr>
               <w:spacing w:after="120"/>
+              <w:jc w:val="both"/>
               <w:rPr>
                 <w:rFonts w:ascii="Arial" w:hAnsi="Arial" w:cs="Arial"/>
                 <w:color w:val="000000"/>
@@ -10404,6 +11019,7 @@
                 <w:between w:val="nil"/>
               </w:pBdr>
               <w:spacing w:after="120"/>
+              <w:jc w:val="both"/>
               <w:rPr>
                 <w:rFonts w:ascii="Arial" w:hAnsi="Arial" w:cs="Arial"/>
                 <w:color w:val="000000"/>
@@ -10434,6 +11050,7 @@
                 <w:between w:val="nil"/>
               </w:pBdr>
               <w:spacing w:after="120"/>
+              <w:jc w:val="both"/>
               <w:rPr>
                 <w:rFonts w:ascii="Arial" w:hAnsi="Arial" w:cs="Arial"/>
                 <w:color w:val="000000"/>
@@ -10473,6 +11090,7 @@
                 <w:between w:val="nil"/>
               </w:pBdr>
               <w:spacing w:after="120"/>
+              <w:jc w:val="both"/>
               <w:rPr>
                 <w:rFonts w:ascii="Arial" w:hAnsi="Arial" w:cs="Arial"/>
                 <w:color w:val="000000"/>
@@ -10483,7 +11101,6 @@
                 <w:rFonts w:ascii="Arial" w:hAnsi="Arial" w:cs="Arial"/>
                 <w:color w:val="000000"/>
               </w:rPr>
-              <w:lastRenderedPageBreak/>
               <w:t>4</w:t>
             </w:r>
           </w:p>
@@ -10508,6 +11125,7 @@
                 <w:between w:val="nil"/>
               </w:pBdr>
               <w:spacing w:after="120"/>
+              <w:jc w:val="both"/>
               <w:rPr>
                 <w:rFonts w:ascii="Arial" w:hAnsi="Arial" w:cs="Arial"/>
                 <w:color w:val="000000"/>
@@ -10518,7 +11136,55 @@
                 <w:rFonts w:ascii="Arial" w:hAnsi="Arial" w:cs="Arial"/>
                 <w:color w:val="000000"/>
               </w:rPr>
-              <w:t>Desenvolvimento dos Controllers MVC e telas Thymeleaf com Bootstrap 5</w:t>
+              <w:t xml:space="preserve">Desenvolvimento dos </w:t>
+            </w:r>
+            <w:proofErr w:type="spellStart"/>
+            <w:r>
+              <w:rPr>
+                <w:rFonts w:ascii="Arial" w:hAnsi="Arial" w:cs="Arial"/>
+                <w:color w:val="000000"/>
+              </w:rPr>
+              <w:t>Controllers</w:t>
+            </w:r>
+            <w:proofErr w:type="spellEnd"/>
+            <w:r>
+              <w:rPr>
+                <w:rFonts w:ascii="Arial" w:hAnsi="Arial" w:cs="Arial"/>
+                <w:color w:val="000000"/>
+              </w:rPr>
+              <w:t xml:space="preserve"> MVC e telas </w:t>
+            </w:r>
+            <w:proofErr w:type="spellStart"/>
+            <w:r>
+              <w:rPr>
+                <w:rFonts w:ascii="Arial" w:hAnsi="Arial" w:cs="Arial"/>
+                <w:color w:val="000000"/>
+              </w:rPr>
+              <w:t>Thymeleaf</w:t>
+            </w:r>
+            <w:proofErr w:type="spellEnd"/>
+            <w:r>
+              <w:rPr>
+                <w:rFonts w:ascii="Arial" w:hAnsi="Arial" w:cs="Arial"/>
+                <w:color w:val="000000"/>
+              </w:rPr>
+              <w:t xml:space="preserve"> com </w:t>
+            </w:r>
+            <w:proofErr w:type="spellStart"/>
+            <w:r>
+              <w:rPr>
+                <w:rFonts w:ascii="Arial" w:hAnsi="Arial" w:cs="Arial"/>
+                <w:color w:val="000000"/>
+              </w:rPr>
+              <w:t>Bootstrap</w:t>
+            </w:r>
+            <w:proofErr w:type="spellEnd"/>
+            <w:r>
+              <w:rPr>
+                <w:rFonts w:ascii="Arial" w:hAnsi="Arial" w:cs="Arial"/>
+                <w:color w:val="000000"/>
+              </w:rPr>
+              <w:t xml:space="preserve"> 5</w:t>
             </w:r>
           </w:p>
         </w:tc>
@@ -10542,6 +11208,7 @@
                 <w:between w:val="nil"/>
               </w:pBdr>
               <w:spacing w:after="120"/>
+              <w:jc w:val="both"/>
               <w:rPr>
                 <w:rFonts w:ascii="Arial" w:hAnsi="Arial" w:cs="Arial"/>
                 <w:color w:val="000000"/>
@@ -10576,6 +11243,7 @@
                 <w:between w:val="nil"/>
               </w:pBdr>
               <w:spacing w:after="120"/>
+              <w:jc w:val="both"/>
               <w:rPr>
                 <w:rFonts w:ascii="Arial" w:hAnsi="Arial" w:cs="Arial"/>
                 <w:color w:val="000000"/>
@@ -10606,6 +11274,7 @@
                 <w:between w:val="nil"/>
               </w:pBdr>
               <w:spacing w:after="120"/>
+              <w:jc w:val="both"/>
               <w:rPr>
                 <w:rFonts w:ascii="Arial" w:hAnsi="Arial" w:cs="Arial"/>
                 <w:color w:val="000000"/>
@@ -10645,6 +11314,7 @@
                 <w:between w:val="nil"/>
               </w:pBdr>
               <w:spacing w:after="120"/>
+              <w:jc w:val="both"/>
               <w:rPr>
                 <w:rFonts w:ascii="Arial" w:hAnsi="Arial" w:cs="Arial"/>
                 <w:color w:val="000000"/>
@@ -10683,6 +11353,7 @@
                 <w:between w:val="nil"/>
               </w:pBdr>
               <w:spacing w:after="120"/>
+              <w:jc w:val="both"/>
               <w:rPr>
                 <w:rFonts w:ascii="Arial" w:hAnsi="Arial" w:cs="Arial"/>
                 <w:color w:val="000000"/>
@@ -10697,7 +11368,47 @@
                 <w:sz w:val="22"/>
                 <w:szCs w:val="22"/>
               </w:rPr>
-              <w:t>Integração do iText PDF, Tom Select, testes de consistência e homologação.</w:t>
+              <w:t xml:space="preserve">Integração do </w:t>
+            </w:r>
+            <w:proofErr w:type="spellStart"/>
+            <w:r>
+              <w:rPr>
+                <w:rFonts w:ascii="Arial" w:hAnsi="Arial" w:cs="Arial"/>
+                <w:color w:val="000000"/>
+                <w:sz w:val="22"/>
+                <w:szCs w:val="22"/>
+              </w:rPr>
+              <w:t>iText</w:t>
+            </w:r>
+            <w:proofErr w:type="spellEnd"/>
+            <w:r>
+              <w:rPr>
+                <w:rFonts w:ascii="Arial" w:hAnsi="Arial" w:cs="Arial"/>
+                <w:color w:val="000000"/>
+                <w:sz w:val="22"/>
+                <w:szCs w:val="22"/>
+              </w:rPr>
+              <w:t xml:space="preserve"> PDF, Tom </w:t>
+            </w:r>
+            <w:proofErr w:type="spellStart"/>
+            <w:r>
+              <w:rPr>
+                <w:rFonts w:ascii="Arial" w:hAnsi="Arial" w:cs="Arial"/>
+                <w:color w:val="000000"/>
+                <w:sz w:val="22"/>
+                <w:szCs w:val="22"/>
+              </w:rPr>
+              <w:t>Select</w:t>
+            </w:r>
+            <w:proofErr w:type="spellEnd"/>
+            <w:r>
+              <w:rPr>
+                <w:rFonts w:ascii="Arial" w:hAnsi="Arial" w:cs="Arial"/>
+                <w:color w:val="000000"/>
+                <w:sz w:val="22"/>
+                <w:szCs w:val="22"/>
+              </w:rPr>
+              <w:t>, testes de consistência e homologação.</w:t>
             </w:r>
           </w:p>
         </w:tc>
@@ -10721,6 +11432,7 @@
                 <w:between w:val="nil"/>
               </w:pBdr>
               <w:spacing w:after="120"/>
+              <w:jc w:val="both"/>
               <w:rPr>
                 <w:rFonts w:ascii="Arial" w:hAnsi="Arial" w:cs="Arial"/>
                 <w:color w:val="000000"/>
@@ -10759,6 +11471,7 @@
                 <w:between w:val="nil"/>
               </w:pBdr>
               <w:spacing w:after="120"/>
+              <w:jc w:val="both"/>
               <w:rPr>
                 <w:rFonts w:ascii="Arial" w:hAnsi="Arial" w:cs="Arial"/>
                 <w:color w:val="000000"/>
@@ -10793,6 +11506,7 @@
                 <w:between w:val="nil"/>
               </w:pBdr>
               <w:spacing w:after="120"/>
+              <w:jc w:val="both"/>
               <w:rPr>
                 <w:rFonts w:ascii="Arial" w:hAnsi="Arial" w:cs="Arial"/>
                 <w:color w:val="000000"/>
@@ -10872,22 +11586,16 @@
       <w:r>
         <w:rPr>
           <w:color w:val="000000"/>
-          <w:sz w:val="20"/>
-          <w:szCs w:val="20"/>
         </w:rPr>
         <w:t xml:space="preserve">- </w:t>
       </w:r>
       <w:r>
-        <w:rPr>
-          <w:color w:val="1F497D"/>
-          <w:sz w:val="20"/>
-          <w:szCs w:val="20"/>
-        </w:rPr>
         <w:t>&lt;Nome da Técnica e descrição dos procedimentos e resultados obtidos&gt;</w:t>
       </w:r>
     </w:p>
     <w:p>
       <w:pPr>
+        <w:jc w:val="both"/>
         <w:rPr>
           <w:color w:val="000000"/>
         </w:rPr>
@@ -10900,6 +11608,7 @@
           <w:ilvl w:val="0"/>
           <w:numId w:val="23"/>
         </w:numPr>
+        <w:jc w:val="both"/>
         <w:rPr>
           <w:rFonts w:ascii="Arial" w:hAnsi="Arial" w:cs="Arial"/>
           <w:color w:val="000000"/>
@@ -10920,6 +11629,7 @@
           <w:ilvl w:val="0"/>
           <w:numId w:val="23"/>
         </w:numPr>
+        <w:jc w:val="both"/>
         <w:rPr>
           <w:rFonts w:ascii="Arial" w:hAnsi="Arial" w:cs="Arial"/>
           <w:color w:val="000000"/>
@@ -10930,7 +11640,39 @@
           <w:rFonts w:ascii="Arial" w:hAnsi="Arial" w:cs="Arial"/>
           <w:color w:val="000000"/>
         </w:rPr>
-        <w:t xml:space="preserve">Descrição dos Procedimentos: O levantamento foi conduzido por meio da verificação sistemática de documentos comerciais reais e da observação do cotidiano da loja Prototech, visando mepear o fluxo passo a passo dos processos de negócio focados em suprimentos de vendas. </w:t>
+        <w:t xml:space="preserve">Descrição dos Procedimentos: O levantamento foi conduzido por meio da verificação sistemática de documentos comerciais reais e da observação do cotidiano da loja </w:t>
+      </w:r>
+      <w:proofErr w:type="spellStart"/>
+      <w:r>
+        <w:rPr>
+          <w:rFonts w:ascii="Arial" w:hAnsi="Arial" w:cs="Arial"/>
+          <w:color w:val="000000"/>
+        </w:rPr>
+        <w:t>Prototech</w:t>
+      </w:r>
+      <w:proofErr w:type="spellEnd"/>
+      <w:r>
+        <w:rPr>
+          <w:rFonts w:ascii="Arial" w:hAnsi="Arial" w:cs="Arial"/>
+          <w:color w:val="000000"/>
+        </w:rPr>
+        <w:t xml:space="preserve">, visando </w:t>
+      </w:r>
+      <w:proofErr w:type="spellStart"/>
+      <w:r>
+        <w:rPr>
+          <w:rFonts w:ascii="Arial" w:hAnsi="Arial" w:cs="Arial"/>
+          <w:color w:val="000000"/>
+        </w:rPr>
+        <w:t>mepear</w:t>
+      </w:r>
+      <w:proofErr w:type="spellEnd"/>
+      <w:r>
+        <w:rPr>
+          <w:rFonts w:ascii="Arial" w:hAnsi="Arial" w:cs="Arial"/>
+          <w:color w:val="000000"/>
+        </w:rPr>
+        <w:t xml:space="preserve"> o fluxo passo a passo dos processos de negócio focados em suprimentos de vendas. </w:t>
       </w:r>
     </w:p>
     <w:p>
@@ -10940,6 +11682,7 @@
           <w:ilvl w:val="0"/>
           <w:numId w:val="23"/>
         </w:numPr>
+        <w:jc w:val="both"/>
         <w:rPr>
           <w:rFonts w:ascii="Arial" w:eastAsia="Arial" w:hAnsi="Arial" w:cs="Arial"/>
         </w:rPr>
@@ -11171,7 +11914,6 @@
     <w:lvl w:ilvl="0">
       <w:start w:val="1"/>
       <w:numFmt w:val="decimal"/>
-      <w:pStyle w:val="Ttulo1"/>
       <w:lvlText w:val="%1."/>
       <w:lvlJc w:val="left"/>
       <w:pPr>
@@ -13979,12 +14721,11 @@
     <w:autoRedefine/>
     <w:uiPriority w:val="9"/>
     <w:qFormat/>
-    <w:rsid w:val="00883489"/>
+    <w:rsid w:val="00C1617D"/>
     <w:pPr>
       <w:keepNext/>
-      <w:numPr>
-        <w:numId w:val="18"/>
-      </w:numPr>
+      <w:ind w:left="720" w:hanging="360"/>
+      <w:jc w:val="both"/>
       <w:outlineLvl w:val="0"/>
     </w:pPr>
     <w:rPr>
@@ -14838,10 +15579,8 @@
     <w:rsid w:val="00596F5F"/>
     <w:pPr>
       <w:keepLines/>
-      <w:numPr>
-        <w:numId w:val="0"/>
-      </w:numPr>
       <w:spacing w:before="240" w:line="259" w:lineRule="auto"/>
+      <w:ind w:left="0" w:firstLine="0"/>
       <w:outlineLvl w:val="9"/>
     </w:pPr>
     <w:rPr>

</xml_diff>